<commit_message>
docs: generate expanded 45+ page Master Project Report in DOCX with 10 real production UI screenshots and 7 UML/ER/DFD diagrams
</commit_message>
<xml_diff>
--- a/SkillForge_AI_Master_Project_Report.docx
+++ b/SkillForge_AI_Master_Project_Report.docx
@@ -343,7 +343,7 @@
           <w:color w:val="1E293B"/>
           <w:sz w:val="22"/>
         </w:rPr>
-        <w:t>I wish to place on record my heartfelt appreciation and profound gratitude to my supervisor, Dr. Supervisor, for their invaluable mentorship, continuous encouragement, and insightful technical feedback throughout the development of SkillForge AI. Their high academic rigor and constructive critiques greatly shaped the architecture of this platform.</w:t>
+        <w:t>I wish to place on record my heartfelt appreciation and profound gratitude to my project supervisor, Dr. Supervisor, for their constant guidance, valuable technical advice, constructive criticism, and encouragement throughout the development of SkillForge AI. Their high academic rigor and constructive critiques greatly shaped the architecture of this platform.</w:t>
       </w:r>
     </w:p>
     <w:p>
@@ -419,7 +419,7 @@
           <w:color w:val="1E293B"/>
           <w:sz w:val="22"/>
         </w:rPr>
-        <w:t>In higher education, scaling individualized feedback and fair, objective assessment across massive cohorts represents a fundamental engineering and pedagogical challenge. Traditional Learning Management Systems (LMS) remain passive content repositories, while manual subjective grading suffers from unconscious human bias, halo effects, and high evaluator burnout. Furthermore, ungrounded conversational AI models frequently hallucinate and solve assignments directly without fostering critical cognitive reasoning.</w:t>
+        <w:t>In modern higher education, scaling individualized feedback and fair, objective assessment across massive cohorts represents a fundamental engineering and pedagogical challenge. Traditional Learning Management Systems (LMS) remain passive content repositories, while manual subjective grading suffers from unconscious human bias, halo effects, and high evaluator burnout. Furthermore, ungrounded conversational AI models frequently hallucinate and solve assignments directly without fostering critical cognitive reasoning.</w:t>
       </w:r>
     </w:p>
     <w:p>
@@ -612,7 +612,7 @@
           <w:rFonts w:ascii="Times New Roman" w:hAnsi="Times New Roman"/>
           <w:sz w:val="22"/>
         </w:rPr>
-        <w:t>List of Figures</w:t>
+        <w:t>List of Figures &amp; Screenshots</w:t>
       </w:r>
       <w:r>
         <w:rPr>
@@ -620,7 +620,7 @@
           <w:color w:val="94A3B8"/>
           <w:sz w:val="20"/>
         </w:rPr>
-        <w:t xml:space="preserve"> ............................................................. </w:t>
+        <w:t xml:space="preserve"> ............................................... </w:t>
       </w:r>
       <w:r>
         <w:rPr>
@@ -654,7 +654,7 @@
           <w:rFonts w:ascii="Times New Roman" w:hAnsi="Times New Roman"/>
           <w:sz w:val="22"/>
         </w:rPr>
-        <w:t>ix</w:t>
+        <w:t>x</w:t>
       </w:r>
     </w:p>
     <w:p>
@@ -737,7 +737,7 @@
           <w:rFonts w:ascii="Times New Roman" w:hAnsi="Times New Roman"/>
           <w:sz w:val="22"/>
         </w:rPr>
-        <w:t>2</w:t>
+        <w:t>3</w:t>
       </w:r>
     </w:p>
     <w:p>
@@ -764,7 +764,7 @@
           <w:rFonts w:ascii="Times New Roman" w:hAnsi="Times New Roman"/>
           <w:sz w:val="22"/>
         </w:rPr>
-        <w:t>3</w:t>
+        <w:t>4</w:t>
       </w:r>
     </w:p>
     <w:p>
@@ -791,7 +791,7 @@
           <w:rFonts w:ascii="Times New Roman" w:hAnsi="Times New Roman"/>
           <w:sz w:val="22"/>
         </w:rPr>
-        <w:t>4</w:t>
+        <w:t>5</w:t>
       </w:r>
     </w:p>
     <w:p>
@@ -803,7 +803,7 @@
           <w:rFonts w:ascii="Times New Roman" w:hAnsi="Times New Roman"/>
           <w:sz w:val="22"/>
         </w:rPr>
-        <w:t xml:space="preserve">    1.5 Scope of the Project</w:t>
+        <w:t xml:space="preserve">    1.5 Scope of the Project (Functional &amp; Non-Functional)</w:t>
       </w:r>
       <w:r>
         <w:rPr>
@@ -811,14 +811,14 @@
           <w:color w:val="94A3B8"/>
           <w:sz w:val="20"/>
         </w:rPr>
-        <w:t xml:space="preserve"> ................................................ </w:t>
+        <w:t xml:space="preserve"> .................. </w:t>
       </w:r>
       <w:r>
         <w:rPr>
           <w:rFonts w:ascii="Times New Roman" w:hAnsi="Times New Roman"/>
           <w:sz w:val="22"/>
         </w:rPr>
-        <w:t>5</w:t>
+        <w:t>6</w:t>
       </w:r>
     </w:p>
     <w:p>
@@ -845,7 +845,7 @@
           <w:rFonts w:ascii="Times New Roman" w:hAnsi="Times New Roman"/>
           <w:sz w:val="22"/>
         </w:rPr>
-        <w:t>6</w:t>
+        <w:t>8</w:t>
       </w:r>
     </w:p>
     <w:p>
@@ -874,7 +874,7 @@
           <w:b/>
           <w:sz w:val="22"/>
         </w:rPr>
-        <w:t>7</w:t>
+        <w:t>9</w:t>
       </w:r>
     </w:p>
     <w:p>
@@ -901,7 +901,7 @@
           <w:rFonts w:ascii="Times New Roman" w:hAnsi="Times New Roman"/>
           <w:sz w:val="22"/>
         </w:rPr>
-        <w:t>7</w:t>
+        <w:t>9</w:t>
       </w:r>
     </w:p>
     <w:p>
@@ -928,7 +928,7 @@
           <w:rFonts w:ascii="Times New Roman" w:hAnsi="Times New Roman"/>
           <w:sz w:val="22"/>
         </w:rPr>
-        <w:t>8</w:t>
+        <w:t>11</w:t>
       </w:r>
     </w:p>
     <w:p>
@@ -955,7 +955,7 @@
           <w:rFonts w:ascii="Times New Roman" w:hAnsi="Times New Roman"/>
           <w:sz w:val="22"/>
         </w:rPr>
-        <w:t>9</w:t>
+        <w:t>13</w:t>
       </w:r>
     </w:p>
     <w:p>
@@ -982,7 +982,7 @@
           <w:rFonts w:ascii="Times New Roman" w:hAnsi="Times New Roman"/>
           <w:sz w:val="22"/>
         </w:rPr>
-        <w:t>10</w:t>
+        <w:t>15</w:t>
       </w:r>
     </w:p>
     <w:p>
@@ -1009,7 +1009,7 @@
           <w:rFonts w:ascii="Times New Roman" w:hAnsi="Times New Roman"/>
           <w:sz w:val="22"/>
         </w:rPr>
-        <w:t>11</w:t>
+        <w:t>17</w:t>
       </w:r>
     </w:p>
     <w:p>
@@ -1036,7 +1036,7 @@
           <w:rFonts w:ascii="Times New Roman" w:hAnsi="Times New Roman"/>
           <w:sz w:val="22"/>
         </w:rPr>
-        <w:t>12</w:t>
+        <w:t>18</w:t>
       </w:r>
     </w:p>
     <w:p>
@@ -1065,7 +1065,7 @@
           <w:b/>
           <w:sz w:val="22"/>
         </w:rPr>
-        <w:t>13</w:t>
+        <w:t>20</w:t>
       </w:r>
     </w:p>
     <w:p>
@@ -1092,7 +1092,7 @@
           <w:rFonts w:ascii="Times New Roman" w:hAnsi="Times New Roman"/>
           <w:sz w:val="22"/>
         </w:rPr>
-        <w:t>13</w:t>
+        <w:t>20</w:t>
       </w:r>
     </w:p>
     <w:p>
@@ -1119,7 +1119,7 @@
           <w:rFonts w:ascii="Times New Roman" w:hAnsi="Times New Roman"/>
           <w:sz w:val="22"/>
         </w:rPr>
-        <w:t>14</w:t>
+        <w:t>21</w:t>
       </w:r>
     </w:p>
     <w:p>
@@ -1146,7 +1146,7 @@
           <w:rFonts w:ascii="Times New Roman" w:hAnsi="Times New Roman"/>
           <w:sz w:val="22"/>
         </w:rPr>
-        <w:t>16</w:t>
+        <w:t>24</w:t>
       </w:r>
     </w:p>
     <w:p>
@@ -1173,7 +1173,7 @@
           <w:rFonts w:ascii="Times New Roman" w:hAnsi="Times New Roman"/>
           <w:sz w:val="22"/>
         </w:rPr>
-        <w:t>18</w:t>
+        <w:t>26</w:t>
       </w:r>
     </w:p>
     <w:p>
@@ -1200,7 +1200,7 @@
           <w:rFonts w:ascii="Times New Roman" w:hAnsi="Times New Roman"/>
           <w:sz w:val="22"/>
         </w:rPr>
-        <w:t>20</w:t>
+        <w:t>28</w:t>
       </w:r>
     </w:p>
     <w:p>
@@ -1227,7 +1227,7 @@
           <w:rFonts w:ascii="Times New Roman" w:hAnsi="Times New Roman"/>
           <w:sz w:val="22"/>
         </w:rPr>
-        <w:t>21</w:t>
+        <w:t>30</w:t>
       </w:r>
     </w:p>
     <w:p>
@@ -1239,7 +1239,7 @@
           <w:rFonts w:ascii="Times New Roman" w:hAnsi="Times New Roman"/>
           <w:sz w:val="22"/>
         </w:rPr>
-        <w:t xml:space="preserve">    3.7 Entity-Relationship (ER) Schema &amp; Data Dictionary</w:t>
+        <w:t xml:space="preserve">    3.7 Entity-Relationship (ER) Schema &amp; Complete Data Dictionary</w:t>
       </w:r>
       <w:r>
         <w:rPr>
@@ -1247,14 +1247,14 @@
           <w:color w:val="94A3B8"/>
           <w:sz w:val="20"/>
         </w:rPr>
-        <w:t xml:space="preserve"> ................... </w:t>
+        <w:t xml:space="preserve"> .......... </w:t>
       </w:r>
       <w:r>
         <w:rPr>
           <w:rFonts w:ascii="Times New Roman" w:hAnsi="Times New Roman"/>
           <w:sz w:val="22"/>
         </w:rPr>
-        <w:t>23</w:t>
+        <w:t>32</w:t>
       </w:r>
     </w:p>
     <w:p>
@@ -1281,7 +1281,7 @@
           <w:rFonts w:ascii="Times New Roman" w:hAnsi="Times New Roman"/>
           <w:sz w:val="22"/>
         </w:rPr>
-        <w:t>26</w:t>
+        <w:t>36</w:t>
       </w:r>
     </w:p>
     <w:p>
@@ -1308,7 +1308,7 @@
           <w:rFonts w:ascii="Times New Roman" w:hAnsi="Times New Roman"/>
           <w:sz w:val="22"/>
         </w:rPr>
-        <w:t>26</w:t>
+        <w:t>36</w:t>
       </w:r>
     </w:p>
     <w:p>
@@ -1320,7 +1320,7 @@
           <w:rFonts w:ascii="Times New Roman" w:hAnsi="Times New Roman"/>
           <w:sz w:val="22"/>
         </w:rPr>
-        <w:t xml:space="preserve">        3.8.2 Data Flow Diagrams (Level 0, 1, 2)</w:t>
+        <w:t xml:space="preserve">        3.8.2 Data Flow Diagrams (Level 0 Context, Level 1 Decomposition)</w:t>
       </w:r>
       <w:r>
         <w:rPr>
@@ -1328,14 +1328,14 @@
           <w:color w:val="94A3B8"/>
           <w:sz w:val="20"/>
         </w:rPr>
-        <w:t xml:space="preserve"> ............................ </w:t>
+        <w:t xml:space="preserve"> ..... </w:t>
       </w:r>
       <w:r>
         <w:rPr>
           <w:rFonts w:ascii="Times New Roman" w:hAnsi="Times New Roman"/>
           <w:sz w:val="22"/>
         </w:rPr>
-        <w:t>28</w:t>
+        <w:t>38</w:t>
       </w:r>
     </w:p>
     <w:p>
@@ -1362,7 +1362,7 @@
           <w:rFonts w:ascii="Times New Roman" w:hAnsi="Times New Roman"/>
           <w:sz w:val="22"/>
         </w:rPr>
-        <w:t>30</w:t>
+        <w:t>41</w:t>
       </w:r>
     </w:p>
     <w:p>
@@ -1374,7 +1374,7 @@
           <w:rFonts w:ascii="Times New Roman" w:hAnsi="Times New Roman"/>
           <w:sz w:val="22"/>
         </w:rPr>
-        <w:t xml:space="preserve">        3.8.4 Activity Diagrams (Assessment Lifecycle)</w:t>
+        <w:t xml:space="preserve">        3.8.4 Activity Diagrams (Assessment Submission Lifecycle)</w:t>
       </w:r>
       <w:r>
         <w:rPr>
@@ -1382,14 +1382,14 @@
           <w:color w:val="94A3B8"/>
           <w:sz w:val="20"/>
         </w:rPr>
-        <w:t xml:space="preserve"> ...................... </w:t>
+        <w:t xml:space="preserve"> ........... </w:t>
       </w:r>
       <w:r>
         <w:rPr>
           <w:rFonts w:ascii="Times New Roman" w:hAnsi="Times New Roman"/>
           <w:sz w:val="22"/>
         </w:rPr>
-        <w:t>32</w:t>
+        <w:t>43</w:t>
       </w:r>
     </w:p>
     <w:p>
@@ -1418,7 +1418,7 @@
           <w:b/>
           <w:sz w:val="22"/>
         </w:rPr>
-        <w:t>33</w:t>
+        <w:t>45</w:t>
       </w:r>
     </w:p>
     <w:p>
@@ -1430,7 +1430,7 @@
           <w:rFonts w:ascii="Times New Roman" w:hAnsi="Times New Roman"/>
           <w:sz w:val="22"/>
         </w:rPr>
-        <w:t xml:space="preserve">    4.1 Module Description &amp; Breakdown</w:t>
+        <w:t xml:space="preserve">    4.1 Module Description &amp; Architectural Breakdown</w:t>
       </w:r>
       <w:r>
         <w:rPr>
@@ -1438,14 +1438,14 @@
           <w:color w:val="94A3B8"/>
           <w:sz w:val="20"/>
         </w:rPr>
-        <w:t xml:space="preserve"> ...................................... </w:t>
+        <w:t xml:space="preserve"> ........................ </w:t>
       </w:r>
       <w:r>
         <w:rPr>
           <w:rFonts w:ascii="Times New Roman" w:hAnsi="Times New Roman"/>
           <w:sz w:val="22"/>
         </w:rPr>
-        <w:t>33</w:t>
+        <w:t>45</w:t>
       </w:r>
     </w:p>
     <w:p>
@@ -1472,7 +1472,7 @@
           <w:rFonts w:ascii="Times New Roman" w:hAnsi="Times New Roman"/>
           <w:sz w:val="22"/>
         </w:rPr>
-        <w:t>36</w:t>
+        <w:t>49</w:t>
       </w:r>
     </w:p>
     <w:p>
@@ -1499,7 +1499,7 @@
           <w:rFonts w:ascii="Times New Roman" w:hAnsi="Times New Roman"/>
           <w:sz w:val="22"/>
         </w:rPr>
-        <w:t>39</w:t>
+        <w:t>54</w:t>
       </w:r>
     </w:p>
     <w:p>
@@ -1511,7 +1511,7 @@
           <w:rFonts w:ascii="Times New Roman" w:hAnsi="Times New Roman"/>
           <w:sz w:val="22"/>
         </w:rPr>
-        <w:t xml:space="preserve">    4.4 Output Screenshots &amp; Interface Walkthrough</w:t>
+        <w:t xml:space="preserve">    4.4 Production Output Screenshots &amp; UI Walkthrough</w:t>
       </w:r>
       <w:r>
         <w:rPr>
@@ -1519,14 +1519,14 @@
           <w:color w:val="94A3B8"/>
           <w:sz w:val="20"/>
         </w:rPr>
-        <w:t xml:space="preserve"> .......................... </w:t>
+        <w:t xml:space="preserve"> ...................... </w:t>
       </w:r>
       <w:r>
         <w:rPr>
           <w:rFonts w:ascii="Times New Roman" w:hAnsi="Times New Roman"/>
           <w:sz w:val="22"/>
         </w:rPr>
-        <w:t>40</w:t>
+        <w:t>56</w:t>
       </w:r>
     </w:p>
     <w:p>
@@ -1538,7 +1538,7 @@
           <w:rFonts w:ascii="Times New Roman" w:hAnsi="Times New Roman"/>
           <w:sz w:val="22"/>
         </w:rPr>
-        <w:t xml:space="preserve">    4.5 Discussion of Results &amp; Performance Metrics</w:t>
+        <w:t xml:space="preserve">        4.4.1 Authentication &amp; Role Selection Portal</w:t>
       </w:r>
       <w:r>
         <w:rPr>
@@ -1546,14 +1546,284 @@
           <w:color w:val="94A3B8"/>
           <w:sz w:val="20"/>
         </w:rPr>
-        <w:t xml:space="preserve"> ......................... </w:t>
+        <w:t xml:space="preserve"> ........................ </w:t>
       </w:r>
       <w:r>
         <w:rPr>
           <w:rFonts w:ascii="Times New Roman" w:hAnsi="Times New Roman"/>
           <w:sz w:val="22"/>
         </w:rPr>
-        <w:t>43</w:t>
+        <w:t>56</w:t>
+      </w:r>
+    </w:p>
+    <w:p>
+      <w:pPr>
+        <w:spacing w:before="0" w:after="50" w:line="276" w:lineRule="auto"/>
+      </w:pPr>
+      <w:r>
+        <w:rPr>
+          <w:rFonts w:ascii="Times New Roman" w:hAnsi="Times New Roman"/>
+          <w:sz w:val="22"/>
+        </w:rPr>
+        <w:t xml:space="preserve">        4.4.2 Student Learning Portal &amp; Dashboard</w:t>
+      </w:r>
+      <w:r>
+        <w:rPr>
+          <w:rFonts w:ascii="Times New Roman" w:hAnsi="Times New Roman"/>
+          <w:color w:val="94A3B8"/>
+          <w:sz w:val="20"/>
+        </w:rPr>
+        <w:t xml:space="preserve"> ........................... </w:t>
+      </w:r>
+      <w:r>
+        <w:rPr>
+          <w:rFonts w:ascii="Times New Roman" w:hAnsi="Times New Roman"/>
+          <w:sz w:val="22"/>
+        </w:rPr>
+        <w:t>57</w:t>
+      </w:r>
+    </w:p>
+    <w:p>
+      <w:pPr>
+        <w:spacing w:before="0" w:after="50" w:line="276" w:lineRule="auto"/>
+      </w:pPr>
+      <w:r>
+        <w:rPr>
+          <w:rFonts w:ascii="Times New Roman" w:hAnsi="Times New Roman"/>
+          <w:sz w:val="22"/>
+        </w:rPr>
+        <w:t xml:space="preserve">        4.4.3 Syllabus Knowledge Materials &amp; Extraction</w:t>
+      </w:r>
+      <w:r>
+        <w:rPr>
+          <w:rFonts w:ascii="Times New Roman" w:hAnsi="Times New Roman"/>
+          <w:color w:val="94A3B8"/>
+          <w:sz w:val="20"/>
+        </w:rPr>
+        <w:t xml:space="preserve"> ..................... </w:t>
+      </w:r>
+      <w:r>
+        <w:rPr>
+          <w:rFonts w:ascii="Times New Roman" w:hAnsi="Times New Roman"/>
+          <w:sz w:val="22"/>
+        </w:rPr>
+        <w:t>58</w:t>
+      </w:r>
+    </w:p>
+    <w:p>
+      <w:pPr>
+        <w:spacing w:before="0" w:after="50" w:line="276" w:lineRule="auto"/>
+      </w:pPr>
+      <w:r>
+        <w:rPr>
+          <w:rFonts w:ascii="Times New Roman" w:hAnsi="Times New Roman"/>
+          <w:sz w:val="22"/>
+        </w:rPr>
+        <w:t xml:space="preserve">        4.4.4 Interactive Socratic AI Tutoring Workspace</w:t>
+      </w:r>
+      <w:r>
+        <w:rPr>
+          <w:rFonts w:ascii="Times New Roman" w:hAnsi="Times New Roman"/>
+          <w:color w:val="94A3B8"/>
+          <w:sz w:val="20"/>
+        </w:rPr>
+        <w:t xml:space="preserve"> .................... </w:t>
+      </w:r>
+      <w:r>
+        <w:rPr>
+          <w:rFonts w:ascii="Times New Roman" w:hAnsi="Times New Roman"/>
+          <w:sz w:val="22"/>
+        </w:rPr>
+        <w:t>59</w:t>
+      </w:r>
+    </w:p>
+    <w:p>
+      <w:pPr>
+        <w:spacing w:before="0" w:after="50" w:line="276" w:lineRule="auto"/>
+      </w:pPr>
+      <w:r>
+        <w:rPr>
+          <w:rFonts w:ascii="Times New Roman" w:hAnsi="Times New Roman"/>
+          <w:sz w:val="22"/>
+        </w:rPr>
+        <w:t xml:space="preserve">        4.4.5 Cloud Programming Sandbox &amp; Live Autograder</w:t>
+      </w:r>
+      <w:r>
+        <w:rPr>
+          <w:rFonts w:ascii="Times New Roman" w:hAnsi="Times New Roman"/>
+          <w:color w:val="94A3B8"/>
+          <w:sz w:val="20"/>
+        </w:rPr>
+        <w:t xml:space="preserve"> ................... </w:t>
+      </w:r>
+      <w:r>
+        <w:rPr>
+          <w:rFonts w:ascii="Times New Roman" w:hAnsi="Times New Roman"/>
+          <w:sz w:val="22"/>
+        </w:rPr>
+        <w:t>60</w:t>
+      </w:r>
+    </w:p>
+    <w:p>
+      <w:pPr>
+        <w:spacing w:before="0" w:after="50" w:line="276" w:lineRule="auto"/>
+      </w:pPr>
+      <w:r>
+        <w:rPr>
+          <w:rFonts w:ascii="Times New Roman" w:hAnsi="Times New Roman"/>
+          <w:sz w:val="22"/>
+        </w:rPr>
+        <w:t xml:space="preserve">        4.4.6 Student Academic Progress &amp; Mastery Analytics</w:t>
+      </w:r>
+      <w:r>
+        <w:rPr>
+          <w:rFonts w:ascii="Times New Roman" w:hAnsi="Times New Roman"/>
+          <w:color w:val="94A3B8"/>
+          <w:sz w:val="20"/>
+        </w:rPr>
+        <w:t xml:space="preserve"> ................. </w:t>
+      </w:r>
+      <w:r>
+        <w:rPr>
+          <w:rFonts w:ascii="Times New Roman" w:hAnsi="Times New Roman"/>
+          <w:sz w:val="22"/>
+        </w:rPr>
+        <w:t>61</w:t>
+      </w:r>
+    </w:p>
+    <w:p>
+      <w:pPr>
+        <w:spacing w:before="0" w:after="50" w:line="276" w:lineRule="auto"/>
+      </w:pPr>
+      <w:r>
+        <w:rPr>
+          <w:rFonts w:ascii="Times New Roman" w:hAnsi="Times New Roman"/>
+          <w:sz w:val="22"/>
+        </w:rPr>
+        <w:t xml:space="preserve">        4.4.7 Teacher Classroom Dashboard &amp; Cohort Overview</w:t>
+      </w:r>
+      <w:r>
+        <w:rPr>
+          <w:rFonts w:ascii="Times New Roman" w:hAnsi="Times New Roman"/>
+          <w:color w:val="94A3B8"/>
+          <w:sz w:val="20"/>
+        </w:rPr>
+        <w:t xml:space="preserve"> ................. </w:t>
+      </w:r>
+      <w:r>
+        <w:rPr>
+          <w:rFonts w:ascii="Times New Roman" w:hAnsi="Times New Roman"/>
+          <w:sz w:val="22"/>
+        </w:rPr>
+        <w:t>62</w:t>
+      </w:r>
+    </w:p>
+    <w:p>
+      <w:pPr>
+        <w:spacing w:before="0" w:after="50" w:line="276" w:lineRule="auto"/>
+      </w:pPr>
+      <w:r>
+        <w:rPr>
+          <w:rFonts w:ascii="Times New Roman" w:hAnsi="Times New Roman"/>
+          <w:sz w:val="22"/>
+        </w:rPr>
+        <w:t xml:space="preserve">        4.4.8 Teacher Intervention Center &amp; Heatmaps</w:t>
+      </w:r>
+      <w:r>
+        <w:rPr>
+          <w:rFonts w:ascii="Times New Roman" w:hAnsi="Times New Roman"/>
+          <w:color w:val="94A3B8"/>
+          <w:sz w:val="20"/>
+        </w:rPr>
+        <w:t xml:space="preserve"> ........................ </w:t>
+      </w:r>
+      <w:r>
+        <w:rPr>
+          <w:rFonts w:ascii="Times New Roman" w:hAnsi="Times New Roman"/>
+          <w:sz w:val="22"/>
+        </w:rPr>
+        <w:t>63</w:t>
+      </w:r>
+    </w:p>
+    <w:p>
+      <w:pPr>
+        <w:spacing w:before="0" w:after="50" w:line="276" w:lineRule="auto"/>
+      </w:pPr>
+      <w:r>
+        <w:rPr>
+          <w:rFonts w:ascii="Times New Roman" w:hAnsi="Times New Roman"/>
+          <w:sz w:val="22"/>
+        </w:rPr>
+        <w:t xml:space="preserve">        4.4.9 Teacher Syllabus Taxonomy Builder</w:t>
+      </w:r>
+      <w:r>
+        <w:rPr>
+          <w:rFonts w:ascii="Times New Roman" w:hAnsi="Times New Roman"/>
+          <w:color w:val="94A3B8"/>
+          <w:sz w:val="20"/>
+        </w:rPr>
+        <w:t xml:space="preserve"> ............................. </w:t>
+      </w:r>
+      <w:r>
+        <w:rPr>
+          <w:rFonts w:ascii="Times New Roman" w:hAnsi="Times New Roman"/>
+          <w:sz w:val="22"/>
+        </w:rPr>
+        <w:t>64</w:t>
+      </w:r>
+    </w:p>
+    <w:p>
+      <w:pPr>
+        <w:spacing w:before="0" w:after="50" w:line="276" w:lineRule="auto"/>
+      </w:pPr>
+      <w:r>
+        <w:rPr>
+          <w:rFonts w:ascii="Times New Roman" w:hAnsi="Times New Roman"/>
+          <w:sz w:val="22"/>
+        </w:rPr>
+        <w:t xml:space="preserve">        4.4.10 Administrator Telemetry &amp; Health Center</w:t>
+      </w:r>
+      <w:r>
+        <w:rPr>
+          <w:rFonts w:ascii="Times New Roman" w:hAnsi="Times New Roman"/>
+          <w:color w:val="94A3B8"/>
+          <w:sz w:val="20"/>
+        </w:rPr>
+        <w:t xml:space="preserve"> ...................... </w:t>
+      </w:r>
+      <w:r>
+        <w:rPr>
+          <w:rFonts w:ascii="Times New Roman" w:hAnsi="Times New Roman"/>
+          <w:sz w:val="22"/>
+        </w:rPr>
+        <w:t>65</w:t>
+      </w:r>
+    </w:p>
+    <w:p>
+      <w:pPr>
+        <w:spacing w:before="0" w:after="50" w:line="276" w:lineRule="auto"/>
+      </w:pPr>
+      <w:r>
+        <w:rPr>
+          <w:rFonts w:ascii="Times New Roman" w:hAnsi="Times New Roman"/>
+          <w:sz w:val="22"/>
+        </w:rPr>
+        <w:t xml:space="preserve">    4.5 Discussion of Results &amp; Empirical Performance Benchmarks</w:t>
+      </w:r>
+      <w:r>
+        <w:rPr>
+          <w:rFonts w:ascii="Times New Roman" w:hAnsi="Times New Roman"/>
+          <w:color w:val="94A3B8"/>
+          <w:sz w:val="20"/>
+        </w:rPr>
+        <w:t xml:space="preserve"> ............ </w:t>
+      </w:r>
+      <w:r>
+        <w:rPr>
+          <w:rFonts w:ascii="Times New Roman" w:hAnsi="Times New Roman"/>
+          <w:sz w:val="22"/>
+        </w:rPr>
+        <w:t>66</w:t>
       </w:r>
     </w:p>
     <w:p>
@@ -1582,7 +1852,7 @@
           <w:b/>
           <w:sz w:val="22"/>
         </w:rPr>
-        <w:t>46</w:t>
+        <w:t>70</w:t>
       </w:r>
     </w:p>
     <w:p>
@@ -1594,7 +1864,7 @@
           <w:rFonts w:ascii="Times New Roman" w:hAnsi="Times New Roman"/>
           <w:sz w:val="22"/>
         </w:rPr>
-        <w:t xml:space="preserve">    5.1 Conclusion</w:t>
+        <w:t xml:space="preserve">    5.1 Conclusion &amp; Project Achievements</w:t>
       </w:r>
       <w:r>
         <w:rPr>
@@ -1602,14 +1872,14 @@
           <w:color w:val="94A3B8"/>
           <w:sz w:val="20"/>
         </w:rPr>
-        <w:t xml:space="preserve"> .......................................................... </w:t>
+        <w:t xml:space="preserve"> ................................... </w:t>
       </w:r>
       <w:r>
         <w:rPr>
           <w:rFonts w:ascii="Times New Roman" w:hAnsi="Times New Roman"/>
           <w:sz w:val="22"/>
         </w:rPr>
-        <w:t>46</w:t>
+        <w:t>70</w:t>
       </w:r>
     </w:p>
     <w:p>
@@ -1621,7 +1891,7 @@
           <w:rFonts w:ascii="Times New Roman" w:hAnsi="Times New Roman"/>
           <w:sz w:val="22"/>
         </w:rPr>
-        <w:t xml:space="preserve">    5.2 Limitations</w:t>
+        <w:t xml:space="preserve">    5.2 Technical Limitations</w:t>
       </w:r>
       <w:r>
         <w:rPr>
@@ -1629,14 +1899,14 @@
           <w:color w:val="94A3B8"/>
           <w:sz w:val="20"/>
         </w:rPr>
-        <w:t xml:space="preserve"> ......................................................... </w:t>
+        <w:t xml:space="preserve"> ............................................... </w:t>
       </w:r>
       <w:r>
         <w:rPr>
           <w:rFonts w:ascii="Times New Roman" w:hAnsi="Times New Roman"/>
           <w:sz w:val="22"/>
         </w:rPr>
-        <w:t>47</w:t>
+        <w:t>72</w:t>
       </w:r>
     </w:p>
     <w:p>
@@ -1648,7 +1918,7 @@
           <w:rFonts w:ascii="Times New Roman" w:hAnsi="Times New Roman"/>
           <w:sz w:val="22"/>
         </w:rPr>
-        <w:t xml:space="preserve">    5.3 Future Scope</w:t>
+        <w:t xml:space="preserve">    5.3 Future Scope &amp; Engineering Roadmap</w:t>
       </w:r>
       <w:r>
         <w:rPr>
@@ -1656,14 +1926,14 @@
           <w:color w:val="94A3B8"/>
           <w:sz w:val="20"/>
         </w:rPr>
-        <w:t xml:space="preserve"> ........................................................ </w:t>
+        <w:t xml:space="preserve"> .................................. </w:t>
       </w:r>
       <w:r>
         <w:rPr>
           <w:rFonts w:ascii="Times New Roman" w:hAnsi="Times New Roman"/>
           <w:sz w:val="22"/>
         </w:rPr>
-        <w:t>48</w:t>
+        <w:t>73</w:t>
       </w:r>
     </w:p>
     <w:p>
@@ -1692,7 +1962,7 @@
           <w:b/>
           <w:sz w:val="22"/>
         </w:rPr>
-        <w:t>49</w:t>
+        <w:t>75</w:t>
       </w:r>
     </w:p>
     <w:p>
@@ -1705,7 +1975,7 @@
           <w:b/>
           <w:sz w:val="22"/>
         </w:rPr>
-        <w:t>Appendix: Configuration &amp; Sample Schemas</w:t>
+        <w:t>Appendix: Data Models &amp; Configuration Schemas</w:t>
       </w:r>
       <w:r>
         <w:rPr>
@@ -1713,14 +1983,14 @@
           <w:color w:val="94A3B8"/>
           <w:sz w:val="20"/>
         </w:rPr>
-        <w:t xml:space="preserve"> .................................... </w:t>
+        <w:t xml:space="preserve"> ............................... </w:t>
       </w:r>
       <w:r>
         <w:rPr>
           <w:rFonts w:ascii="Times New Roman" w:hAnsi="Times New Roman"/>
           <w:sz w:val="22"/>
         </w:rPr>
-        <w:t>52</w:t>
+        <w:t>78</w:t>
       </w:r>
     </w:p>
     <w:p>
@@ -1738,7 +2008,7 @@
           <w:b/>
           <w:sz w:val="32"/>
         </w:rPr>
-        <w:t>List of Figures</w:t>
+        <w:t>List of Figures &amp; Screenshots</w:t>
       </w:r>
     </w:p>
     <w:p>
@@ -1765,7 +2035,7 @@
           <w:rFonts w:ascii="Times New Roman" w:hAnsi="Times New Roman"/>
           <w:sz w:val="22"/>
         </w:rPr>
-        <w:t>15</w:t>
+        <w:t>23</w:t>
       </w:r>
     </w:p>
     <w:p>
@@ -1777,7 +2047,7 @@
           <w:rFonts w:ascii="Times New Roman" w:hAnsi="Times New Roman"/>
           <w:sz w:val="22"/>
         </w:rPr>
-        <w:t>Figure 3.2: Retrieval-Augmented Generation (RAG) Ingestion Flow</w:t>
+        <w:t>Figure 3.2: SkillForge AI Relational Entity-Relationship (ER) Schema</w:t>
       </w:r>
       <w:r>
         <w:rPr>
@@ -1785,14 +2055,14 @@
           <w:color w:val="94A3B8"/>
           <w:sz w:val="20"/>
         </w:rPr>
-        <w:t xml:space="preserve"> ............ </w:t>
+        <w:t xml:space="preserve"> ....... </w:t>
       </w:r>
       <w:r>
         <w:rPr>
           <w:rFonts w:ascii="Times New Roman" w:hAnsi="Times New Roman"/>
           <w:sz w:val="22"/>
         </w:rPr>
-        <w:t>19</w:t>
+        <w:t>33</w:t>
       </w:r>
     </w:p>
     <w:p>
@@ -1804,7 +2074,7 @@
           <w:rFonts w:ascii="Times New Roman" w:hAnsi="Times New Roman"/>
           <w:sz w:val="22"/>
         </w:rPr>
-        <w:t>Figure 3.3: SkillForge AI Relational Entity-Relationship (ER) Schema</w:t>
+        <w:t>Figure 3.3: System Use Case Model (Student, Teacher, Admin Actors)</w:t>
       </w:r>
       <w:r>
         <w:rPr>
@@ -1812,14 +2082,14 @@
           <w:color w:val="94A3B8"/>
           <w:sz w:val="20"/>
         </w:rPr>
-        <w:t xml:space="preserve"> ....... </w:t>
+        <w:t xml:space="preserve"> ......... </w:t>
       </w:r>
       <w:r>
         <w:rPr>
           <w:rFonts w:ascii="Times New Roman" w:hAnsi="Times New Roman"/>
           <w:sz w:val="22"/>
         </w:rPr>
-        <w:t>24</w:t>
+        <w:t>37</w:t>
       </w:r>
     </w:p>
     <w:p>
@@ -1831,7 +2101,7 @@
           <w:rFonts w:ascii="Times New Roman" w:hAnsi="Times New Roman"/>
           <w:sz w:val="22"/>
         </w:rPr>
-        <w:t>Figure 3.4: System Use Case Model (Student, Teacher, Admin Actors)</w:t>
+        <w:t>Figure 3.4: DFD Level 0 — Context Diagram</w:t>
       </w:r>
       <w:r>
         <w:rPr>
@@ -1839,14 +2109,14 @@
           <w:color w:val="94A3B8"/>
           <w:sz w:val="20"/>
         </w:rPr>
-        <w:t xml:space="preserve"> ......... </w:t>
+        <w:t xml:space="preserve"> .................................. </w:t>
       </w:r>
       <w:r>
         <w:rPr>
           <w:rFonts w:ascii="Times New Roman" w:hAnsi="Times New Roman"/>
           <w:sz w:val="22"/>
         </w:rPr>
-        <w:t>27</w:t>
+        <w:t>39</w:t>
       </w:r>
     </w:p>
     <w:p>
@@ -1858,7 +2128,7 @@
           <w:rFonts w:ascii="Times New Roman" w:hAnsi="Times New Roman"/>
           <w:sz w:val="22"/>
         </w:rPr>
-        <w:t>Figure 3.5: DFD Level 0 — Context Diagram</w:t>
+        <w:t>Figure 3.5: DFD Level 1 — Core Process Decomposition</w:t>
       </w:r>
       <w:r>
         <w:rPr>
@@ -1866,14 +2136,14 @@
           <w:color w:val="94A3B8"/>
           <w:sz w:val="20"/>
         </w:rPr>
-        <w:t xml:space="preserve"> .................................. </w:t>
+        <w:t xml:space="preserve"> ....................... </w:t>
       </w:r>
       <w:r>
         <w:rPr>
           <w:rFonts w:ascii="Times New Roman" w:hAnsi="Times New Roman"/>
           <w:sz w:val="22"/>
         </w:rPr>
-        <w:t>28</w:t>
+        <w:t>40</w:t>
       </w:r>
     </w:p>
     <w:p>
@@ -1885,7 +2155,7 @@
           <w:rFonts w:ascii="Times New Roman" w:hAnsi="Times New Roman"/>
           <w:sz w:val="22"/>
         </w:rPr>
-        <w:t>Figure 3.6: DFD Level 1 — Core Process Decomposition</w:t>
+        <w:t>Figure 3.6: Sequence Diagram for Double-Blind FairGrade Lifecycle</w:t>
       </w:r>
       <w:r>
         <w:rPr>
@@ -1893,14 +2163,14 @@
           <w:color w:val="94A3B8"/>
           <w:sz w:val="20"/>
         </w:rPr>
-        <w:t xml:space="preserve"> ....................... </w:t>
+        <w:t xml:space="preserve"> .......... </w:t>
       </w:r>
       <w:r>
         <w:rPr>
           <w:rFonts w:ascii="Times New Roman" w:hAnsi="Times New Roman"/>
           <w:sz w:val="22"/>
         </w:rPr>
-        <w:t>29</w:t>
+        <w:t>42</w:t>
       </w:r>
     </w:p>
     <w:p>
@@ -1912,7 +2182,7 @@
           <w:rFonts w:ascii="Times New Roman" w:hAnsi="Times New Roman"/>
           <w:sz w:val="22"/>
         </w:rPr>
-        <w:t>Figure 3.7: Sequence Diagram for Double-Blind FairGrade Lifecycle</w:t>
+        <w:t>Figure 3.7: Activity Diagram for Adaptive Assessment Submission</w:t>
       </w:r>
       <w:r>
         <w:rPr>
@@ -1920,14 +2190,14 @@
           <w:color w:val="94A3B8"/>
           <w:sz w:val="20"/>
         </w:rPr>
-        <w:t xml:space="preserve"> .......... </w:t>
+        <w:t xml:space="preserve"> ............ </w:t>
       </w:r>
       <w:r>
         <w:rPr>
           <w:rFonts w:ascii="Times New Roman" w:hAnsi="Times New Roman"/>
           <w:sz w:val="22"/>
         </w:rPr>
-        <w:t>31</w:t>
+        <w:t>44</w:t>
       </w:r>
     </w:p>
     <w:p>
@@ -1939,7 +2209,7 @@
           <w:rFonts w:ascii="Times New Roman" w:hAnsi="Times New Roman"/>
           <w:sz w:val="22"/>
         </w:rPr>
-        <w:t>Figure 3.8: Activity Diagram for Adaptive Assessment Submission</w:t>
+        <w:t>Figure 4.1: Glassmorphic Authentication &amp; Role Selector Screen</w:t>
       </w:r>
       <w:r>
         <w:rPr>
@@ -1947,14 +2217,14 @@
           <w:color w:val="94A3B8"/>
           <w:sz w:val="20"/>
         </w:rPr>
-        <w:t xml:space="preserve"> ............ </w:t>
+        <w:t xml:space="preserve"> ............. </w:t>
       </w:r>
       <w:r>
         <w:rPr>
           <w:rFonts w:ascii="Times New Roman" w:hAnsi="Times New Roman"/>
           <w:sz w:val="22"/>
         </w:rPr>
-        <w:t>32</w:t>
+        <w:t>56</w:t>
       </w:r>
     </w:p>
     <w:p>
@@ -1966,7 +2236,7 @@
           <w:rFonts w:ascii="Times New Roman" w:hAnsi="Times New Roman"/>
           <w:sz w:val="22"/>
         </w:rPr>
-        <w:t>Figure 4.1: Glassmorphic Authentication &amp; Role Selector Screen</w:t>
+        <w:t>Figure 4.2: Student Learning Portal &amp; Enrolled Classrooms Screen</w:t>
       </w:r>
       <w:r>
         <w:rPr>
@@ -1974,14 +2244,14 @@
           <w:color w:val="94A3B8"/>
           <w:sz w:val="20"/>
         </w:rPr>
-        <w:t xml:space="preserve"> ............. </w:t>
+        <w:t xml:space="preserve"> ........... </w:t>
       </w:r>
       <w:r>
         <w:rPr>
           <w:rFonts w:ascii="Times New Roman" w:hAnsi="Times New Roman"/>
           <w:sz w:val="22"/>
         </w:rPr>
-        <w:t>40</w:t>
+        <w:t>57</w:t>
       </w:r>
     </w:p>
     <w:p>
@@ -1993,7 +2263,7 @@
           <w:rFonts w:ascii="Times New Roman" w:hAnsi="Times New Roman"/>
           <w:sz w:val="22"/>
         </w:rPr>
-        <w:t>Figure 4.2: Student Learning Portal &amp; Socratic AI Tutor Screen</w:t>
+        <w:t>Figure 4.3: Learning Materials &amp; Extracted Syllabus Taxonomy Screen</w:t>
       </w:r>
       <w:r>
         <w:rPr>
@@ -2001,14 +2271,14 @@
           <w:color w:val="94A3B8"/>
           <w:sz w:val="20"/>
         </w:rPr>
-        <w:t xml:space="preserve"> ............. </w:t>
+        <w:t xml:space="preserve"> ........ </w:t>
       </w:r>
       <w:r>
         <w:rPr>
           <w:rFonts w:ascii="Times New Roman" w:hAnsi="Times New Roman"/>
           <w:sz w:val="22"/>
         </w:rPr>
-        <w:t>41</w:t>
+        <w:t>58</w:t>
       </w:r>
     </w:p>
     <w:p>
@@ -2020,7 +2290,7 @@
           <w:rFonts w:ascii="Times New Roman" w:hAnsi="Times New Roman"/>
           <w:sz w:val="22"/>
         </w:rPr>
-        <w:t>Figure 4.3: Teacher Intervention Center &amp; Classroom Heatmap Screen</w:t>
+        <w:t>Figure 4.4: Socratic AI Tutor Interactive Workspace Screen</w:t>
       </w:r>
       <w:r>
         <w:rPr>
@@ -2028,14 +2298,14 @@
           <w:color w:val="94A3B8"/>
           <w:sz w:val="20"/>
         </w:rPr>
-        <w:t xml:space="preserve"> ......... </w:t>
+        <w:t xml:space="preserve"> ................. </w:t>
       </w:r>
       <w:r>
         <w:rPr>
           <w:rFonts w:ascii="Times New Roman" w:hAnsi="Times New Roman"/>
           <w:sz w:val="22"/>
         </w:rPr>
-        <w:t>42</w:t>
+        <w:t>59</w:t>
       </w:r>
     </w:p>
     <w:p>
@@ -2047,7 +2317,7 @@
           <w:rFonts w:ascii="Times New Roman" w:hAnsi="Times New Roman"/>
           <w:sz w:val="22"/>
         </w:rPr>
-        <w:t>Figure 4.4: FairGrade Automated Rubric Evaluation Scorecard Screen</w:t>
+        <w:t>Figure 4.5: Online Multi-Language Programming Sandbox &amp; Autograder Screen</w:t>
       </w:r>
       <w:r>
         <w:rPr>
@@ -2055,14 +2325,149 @@
           <w:color w:val="94A3B8"/>
           <w:sz w:val="20"/>
         </w:rPr>
-        <w:t xml:space="preserve"> ......... </w:t>
+        <w:t xml:space="preserve"> ..... </w:t>
       </w:r>
       <w:r>
         <w:rPr>
           <w:rFonts w:ascii="Times New Roman" w:hAnsi="Times New Roman"/>
           <w:sz w:val="22"/>
         </w:rPr>
-        <w:t>42</w:t>
+        <w:t>60</w:t>
+      </w:r>
+    </w:p>
+    <w:p>
+      <w:pPr>
+        <w:spacing w:before="0" w:after="60" w:line="276" w:lineRule="auto"/>
+      </w:pPr>
+      <w:r>
+        <w:rPr>
+          <w:rFonts w:ascii="Times New Roman" w:hAnsi="Times New Roman"/>
+          <w:sz w:val="22"/>
+        </w:rPr>
+        <w:t>Figure 4.6: Student Academic Progress &amp; Mastery Analytics Screen</w:t>
+      </w:r>
+      <w:r>
+        <w:rPr>
+          <w:rFonts w:ascii="Times New Roman" w:hAnsi="Times New Roman"/>
+          <w:color w:val="94A3B8"/>
+          <w:sz w:val="20"/>
+        </w:rPr>
+        <w:t xml:space="preserve"> ........... </w:t>
+      </w:r>
+      <w:r>
+        <w:rPr>
+          <w:rFonts w:ascii="Times New Roman" w:hAnsi="Times New Roman"/>
+          <w:sz w:val="22"/>
+        </w:rPr>
+        <w:t>61</w:t>
+      </w:r>
+    </w:p>
+    <w:p>
+      <w:pPr>
+        <w:spacing w:before="0" w:after="60" w:line="276" w:lineRule="auto"/>
+      </w:pPr>
+      <w:r>
+        <w:rPr>
+          <w:rFonts w:ascii="Times New Roman" w:hAnsi="Times New Roman"/>
+          <w:sz w:val="22"/>
+        </w:rPr>
+        <w:t>Figure 4.7: Teacher Classroom Overview &amp; Course Dashboard Screen</w:t>
+      </w:r>
+      <w:r>
+        <w:rPr>
+          <w:rFonts w:ascii="Times New Roman" w:hAnsi="Times New Roman"/>
+          <w:color w:val="94A3B8"/>
+          <w:sz w:val="20"/>
+        </w:rPr>
+        <w:t xml:space="preserve"> ........... </w:t>
+      </w:r>
+      <w:r>
+        <w:rPr>
+          <w:rFonts w:ascii="Times New Roman" w:hAnsi="Times New Roman"/>
+          <w:sz w:val="22"/>
+        </w:rPr>
+        <w:t>62</w:t>
+      </w:r>
+    </w:p>
+    <w:p>
+      <w:pPr>
+        <w:spacing w:before="0" w:after="60" w:line="276" w:lineRule="auto"/>
+      </w:pPr>
+      <w:r>
+        <w:rPr>
+          <w:rFonts w:ascii="Times New Roman" w:hAnsi="Times New Roman"/>
+          <w:sz w:val="22"/>
+        </w:rPr>
+        <w:t>Figure 4.8: Teacher Intervention Center &amp; Topic Mastery Heatmap Screen</w:t>
+      </w:r>
+      <w:r>
+        <w:rPr>
+          <w:rFonts w:ascii="Times New Roman" w:hAnsi="Times New Roman"/>
+          <w:color w:val="94A3B8"/>
+          <w:sz w:val="20"/>
+        </w:rPr>
+        <w:t xml:space="preserve"> ..... </w:t>
+      </w:r>
+      <w:r>
+        <w:rPr>
+          <w:rFonts w:ascii="Times New Roman" w:hAnsi="Times New Roman"/>
+          <w:sz w:val="22"/>
+        </w:rPr>
+        <w:t>63</w:t>
+      </w:r>
+    </w:p>
+    <w:p>
+      <w:pPr>
+        <w:spacing w:before="0" w:after="60" w:line="276" w:lineRule="auto"/>
+      </w:pPr>
+      <w:r>
+        <w:rPr>
+          <w:rFonts w:ascii="Times New Roman" w:hAnsi="Times New Roman"/>
+          <w:sz w:val="22"/>
+        </w:rPr>
+        <w:t>Figure 4.9: Teacher Course Materials &amp; Bloom's Taxonomy Extraction Screen</w:t>
+      </w:r>
+      <w:r>
+        <w:rPr>
+          <w:rFonts w:ascii="Times New Roman" w:hAnsi="Times New Roman"/>
+          <w:color w:val="94A3B8"/>
+          <w:sz w:val="20"/>
+        </w:rPr>
+        <w:t xml:space="preserve"> ..... </w:t>
+      </w:r>
+      <w:r>
+        <w:rPr>
+          <w:rFonts w:ascii="Times New Roman" w:hAnsi="Times New Roman"/>
+          <w:sz w:val="22"/>
+        </w:rPr>
+        <w:t>64</w:t>
+      </w:r>
+    </w:p>
+    <w:p>
+      <w:pPr>
+        <w:spacing w:before="0" w:after="60" w:line="276" w:lineRule="auto"/>
+      </w:pPr>
+      <w:r>
+        <w:rPr>
+          <w:rFonts w:ascii="Times New Roman" w:hAnsi="Times New Roman"/>
+          <w:sz w:val="22"/>
+        </w:rPr>
+        <w:t>Figure 4.10: Admin System Telemetry &amp; AI Services Health Screen</w:t>
+      </w:r>
+      <w:r>
+        <w:rPr>
+          <w:rFonts w:ascii="Times New Roman" w:hAnsi="Times New Roman"/>
+          <w:color w:val="94A3B8"/>
+          <w:sz w:val="20"/>
+        </w:rPr>
+        <w:t xml:space="preserve"> ............ </w:t>
+      </w:r>
+      <w:r>
+        <w:rPr>
+          <w:rFonts w:ascii="Times New Roman" w:hAnsi="Times New Roman"/>
+          <w:sz w:val="22"/>
+        </w:rPr>
+        <w:t>65</w:t>
       </w:r>
     </w:p>
     <w:p>
@@ -2107,7 +2512,7 @@
           <w:rFonts w:ascii="Times New Roman" w:hAnsi="Times New Roman"/>
           <w:sz w:val="22"/>
         </w:rPr>
-        <w:t>12</w:t>
+        <w:t>19</w:t>
       </w:r>
     </w:p>
     <w:p>
@@ -2119,7 +2524,7 @@
           <w:rFonts w:ascii="Times New Roman" w:hAnsi="Times New Roman"/>
           <w:sz w:val="22"/>
         </w:rPr>
-        <w:t>Table 3.1: Complete Technology Stack and System Specifications</w:t>
+        <w:t>Table 3.1: Complete Technology Stack and Microservice Allocations</w:t>
       </w:r>
       <w:r>
         <w:rPr>
@@ -2127,14 +2532,14 @@
           <w:color w:val="94A3B8"/>
           <w:sz w:val="20"/>
         </w:rPr>
-        <w:t xml:space="preserve"> ............. </w:t>
+        <w:t xml:space="preserve"> .......... </w:t>
       </w:r>
       <w:r>
         <w:rPr>
           <w:rFonts w:ascii="Times New Roman" w:hAnsi="Times New Roman"/>
           <w:sz w:val="22"/>
         </w:rPr>
-        <w:t>17</w:t>
+        <w:t>25</w:t>
       </w:r>
     </w:p>
     <w:p>
@@ -2161,7 +2566,7 @@
           <w:rFonts w:ascii="Times New Roman" w:hAnsi="Times New Roman"/>
           <w:sz w:val="22"/>
         </w:rPr>
-        <w:t>25</w:t>
+        <w:t>34</w:t>
       </w:r>
     </w:p>
     <w:p>
@@ -2188,7 +2593,7 @@
           <w:rFonts w:ascii="Times New Roman" w:hAnsi="Times New Roman"/>
           <w:sz w:val="22"/>
         </w:rPr>
-        <w:t>28</w:t>
+        <w:t>38</w:t>
       </w:r>
     </w:p>
     <w:p>
@@ -2215,7 +2620,7 @@
           <w:rFonts w:ascii="Times New Roman" w:hAnsi="Times New Roman"/>
           <w:sz w:val="22"/>
         </w:rPr>
-        <w:t>43</w:t>
+        <w:t>67</w:t>
       </w:r>
     </w:p>
     <w:p>
@@ -2227,7 +2632,7 @@
           <w:rFonts w:ascii="Times New Roman" w:hAnsi="Times New Roman"/>
           <w:sz w:val="22"/>
         </w:rPr>
-        <w:t>Table 4.2: FairGrade Human vs AI Grading Correlation &amp; Error Metric</w:t>
+        <w:t>Table 4.2: FairGrade Human vs AI Grading Correlation &amp; Error Metrics</w:t>
       </w:r>
       <w:r>
         <w:rPr>
@@ -2235,14 +2640,14 @@
           <w:color w:val="94A3B8"/>
           <w:sz w:val="20"/>
         </w:rPr>
-        <w:t xml:space="preserve"> ........ </w:t>
+        <w:t xml:space="preserve"> ....... </w:t>
       </w:r>
       <w:r>
         <w:rPr>
           <w:rFonts w:ascii="Times New Roman" w:hAnsi="Times New Roman"/>
           <w:sz w:val="22"/>
         </w:rPr>
-        <w:t>44</w:t>
+        <w:t>68</w:t>
       </w:r>
     </w:p>
     <w:p>
@@ -2269,7 +2674,7 @@
           <w:rFonts w:ascii="Times New Roman" w:hAnsi="Times New Roman"/>
           <w:sz w:val="22"/>
         </w:rPr>
-        <w:t>45</w:t>
+        <w:t>69</w:t>
       </w:r>
     </w:p>
     <w:p>
@@ -2280,7 +2685,7 @@
     <w:p>
       <w:pPr>
         <w:keepNext/>
-        <w:spacing w:before="320" w:after="160"/>
+        <w:spacing w:before="360" w:after="160"/>
       </w:pPr>
       <w:r>
         <w:rPr>
@@ -2317,7 +2722,7 @@
           <w:color w:val="1E293B"/>
           <w:sz w:val="22"/>
         </w:rPr>
-        <w:t>The rapid digital transformation of higher education and the explosive growth of student enrollments in computer science, engineering, and data disciplines have placed unprecedented strain on institutional teaching and assessment methodologies. In university classrooms with cohorts ranging from 60 to over 500 students, the traditional educational paradigm—characterized by close, personalized apprenticeship, detailed qualitative feedback on written essays, and immediate debugging assistance during programming labs—has become increasingly untenable.</w:t>
+        <w:t>The rapid digital transformation of global higher education and the explosive growth of student enrollments in computer science, software engineering, and computational disciplines have placed unprecedented strain on institutional teaching, mentoring, and assessment methodologies. In university classrooms with cohorts frequently ranging from 60 to over 500 students, the classical educational ideal—characterized by close, personalized apprenticeship, rapid qualitative feedback on written proofs, and immediate line-by-line debugging assistance during programming labs—has become structurally untenable.</w:t>
       </w:r>
     </w:p>
     <w:p>
@@ -2330,7 +2735,7 @@
           <w:color w:val="1E293B"/>
           <w:sz w:val="22"/>
         </w:rPr>
-        <w:t>To manage these unsustainable evaluation workloads, academic institutions frequently resort to high-stakes, reductionist evaluation mechanisms such as multiple-choice questions (MCQs) or binary pass/fail unit testing suites. While these instruments offer high administrative throughput, they measure only low-level factual recall or superficial code compilation. They fail entirely to assess higher-order cognitive competencies, including architectural design reasoning, mathematical proof construction, conceptual differentiation, and algorithmic problem decomposition.</w:t>
+        <w:t>To manage these unsustainable grading workloads, academic institutions frequently resort to high-throughput, reductionist evaluation instruments such as multiple-choice questions (MCQs) or binary pass/fail unit testing scripts. While these mechanisms provide automated scoring, they measure only low-level factual recall or superficial code compilation. They fail entirely to measure higher-order cognitive competencies, such as architectural reasoning, mathematical proof rigor, conceptual differentiation, and algorithmic problem decomposition.</w:t>
       </w:r>
     </w:p>
     <w:p>
@@ -2343,7 +2748,7 @@
           <w:color w:val="1E293B"/>
           <w:sz w:val="22"/>
         </w:rPr>
-        <w:t>When open-ended subjective assessments, written proofs, and coding exercises are assigned, manual evaluation by human educators introduces severe cognitive bottlenecks. Evaluating hundreds of complex, idiosyncratic student submissions leads to grading fatigue, halo effects (where prior student performance skews subsequent evaluation), and marked inter-rater variance across teaching assistants. Furthermore, students typically wait weeks to receive graded papers, by which point the pedagogical window for timely cognitive reinforcement has passed.</w:t>
+        <w:t>When open-ended subjective examinations, written derivations, and multi-file coding projects are assigned, manual evaluation by human educators introduces severe cognitive bottlenecks. Evaluating hundreds of complex, idiosyncratic student submissions inevitably leads to grading fatigue, halo effects (where an evaluator's impression of past student performance skews current marks), and severe inter-rater variance across multiple teaching assistants. Furthermore, students typically wait weeks to receive graded feedback, by which point the pedagogical window for timely cognitive reinforcement has closed.</w:t>
       </w:r>
     </w:p>
     <w:p>
@@ -2384,7 +2789,7 @@
           <w:color w:val="1E293B"/>
           <w:sz w:val="22"/>
         </w:rPr>
-        <w:t>Modern educational systems suffer from three interconnected systemic failures:</w:t>
+        <w:t>Modern educational computing systems suffer from three interconnected systemic failures:</w:t>
       </w:r>
     </w:p>
     <w:p>
@@ -2406,7 +2811,7 @@
           <w:color w:val="1E293B"/>
           <w:sz w:val="22"/>
         </w:rPr>
-        <w:t xml:space="preserve"> Human grading of subjective papers is inherently vulnerable to unconscious identity bias (such as student gender, ethnicity, handwriting neatness, and past academic reputation). A professor evaluating the 80th paper at 11:00 PM applies markedly different cognitive standards than when evaluating the 1st paper at 9:00 AM.</w:t>
+        <w:t xml:space="preserve"> Human grading of subjective papers is inherently vulnerable to unconscious identity bias (such as student gender, ethnicity, handwriting neatness, and past academic reputation). A professor evaluating the 80th paper at midnight applies markedly different cognitive standards than when evaluating the 1st paper at 9:00 AM.</w:t>
       </w:r>
     </w:p>
     <w:p>
@@ -2428,7 +2833,7 @@
           <w:color w:val="1E293B"/>
           <w:sz w:val="22"/>
         </w:rPr>
-        <w:t xml:space="preserve"> When students encounter intellectual bottlenecks while studying complex theoretical subjects (such as Relational Database Normalization, Distributed Consensus, or Operating System Deadlocks), they turn to unconstrained commercial LLM chatbots. These public chatbots lack grounding in the institutional syllabus, hallucinate incorrect facts, and provide direct, fully solved code—short-circuiting the student's cognitive learning cycle and facilitating academic dishonesty.</w:t>
+        <w:t xml:space="preserve"> When students encounter intellectual bottlenecks while studying complex theoretical subjects (such as Relational Normalization, Distributed Consensus, or Operating System Deadlocks), they turn to unconstrained commercial LLM chatbots. These public chatbots lack grounding in the institutional syllabus, hallucinate incorrect facts, and provide direct, fully solved code—short-circuiting the student's cognitive learning cycle and facilitating academic dishonesty.</w:t>
       </w:r>
     </w:p>
     <w:p>
@@ -2657,7 +3062,7 @@
           <w:color w:val="1E3A8A"/>
           <w:sz w:val="26"/>
         </w:rPr>
-        <w:t>1.5 Scope of the Project</w:t>
+        <w:t>1.5 Scope of the Project (Functional &amp; Non-Functional)</w:t>
       </w:r>
     </w:p>
     <w:p>
@@ -2798,7 +3203,7 @@
     <w:p>
       <w:pPr>
         <w:keepNext/>
-        <w:spacing w:before="320" w:after="160"/>
+        <w:spacing w:before="360" w:after="160"/>
       </w:pPr>
       <w:r>
         <w:rPr>
@@ -3706,7 +4111,7 @@
     <w:p>
       <w:pPr>
         <w:keepNext/>
-        <w:spacing w:before="320" w:after="160"/>
+        <w:spacing w:before="360" w:after="160"/>
       </w:pPr>
       <w:r>
         <w:rPr>
@@ -4684,7 +5089,7 @@
           <w:color w:val="1E3A8A"/>
           <w:sz w:val="26"/>
         </w:rPr>
-        <w:t>3.7 Entity-Relationship (ER) Schema &amp; Data Dictionary</w:t>
+        <w:t>3.7 Entity-Relationship (ER) Schema &amp; Complete Data Dictionary</w:t>
       </w:r>
     </w:p>
     <w:p>
@@ -4740,7 +5145,7 @@
           <w:color w:val="475569"/>
           <w:sz w:val="20"/>
         </w:rPr>
-        <w:t>Figure 3.3: SkillForge AI Relational Entity-Relationship (ER) Schema</w:t>
+        <w:t>Figure 3.2: SkillForge AI Relational Entity-Relationship (ER) Schema</w:t>
       </w:r>
     </w:p>
     <w:p>
@@ -5686,7 +6091,7 @@
           <w:color w:val="475569"/>
           <w:sz w:val="20"/>
         </w:rPr>
-        <w:t>Figure 3.4: SkillForge AI System Use Case Model</w:t>
+        <w:t>Figure 3.3: System Use Case Model (Student, Teacher, Admin Actors)</w:t>
       </w:r>
     </w:p>
     <w:p>
@@ -5781,7 +6186,7 @@
           <w:color w:val="334155"/>
           <w:sz w:val="24"/>
         </w:rPr>
-        <w:t>3.8.2 Data Flow Diagrams (DFD Level 0, Level 1, Level 2)</w:t>
+        <w:t>3.8.2 Data Flow Diagrams (Level 0 Context, Level 1 Decomposition)</w:t>
       </w:r>
     </w:p>
     <w:p>
@@ -5837,7 +6242,7 @@
           <w:color w:val="475569"/>
           <w:sz w:val="20"/>
         </w:rPr>
-        <w:t>Figure 3.5: DFD Level 0 — Context Diagram</w:t>
+        <w:t>Figure 3.4: DFD Level 0 — Context Diagram</w:t>
       </w:r>
     </w:p>
     <w:p>
@@ -5893,7 +6298,7 @@
           <w:color w:val="475569"/>
           <w:sz w:val="20"/>
         </w:rPr>
-        <w:t>Figure 3.6: DFD Level 1 — Core Process Decomposition</w:t>
+        <w:t>Figure 3.5: DFD Level 1 — Core Process Decomposition</w:t>
       </w:r>
     </w:p>
     <w:p>
@@ -5906,7 +6311,7 @@
           <w:color w:val="1E293B"/>
           <w:sz w:val="22"/>
         </w:rPr>
-        <w:t>As shown in DFD Level 1 (Figure 3.6), raw student answers flow first into Process 1.0 (Double-Blind Anonymizer), which creates an anonymous token and passes sanitized text to Process 2.0 (FairGrade Evaluator). Process 2.0 consults rubric criteria and outputs scores to Datastore D1 (Submissions Store). Concurrently, Process 4.0 extracts syllabus taxonomies into Datastore D2 (Vector Store), allowing Process 3.0 (Socratic Engine) to serve contextual hints back to the student.</w:t>
+        <w:t>As shown in DFD Level 1 (Figure 3.5), raw student answers flow first into Process 1.0 (Double-Blind Anonymizer), which creates an anonymous token and passes sanitized text to Process 2.0 (FairGrade Evaluator). Process 2.0 consults rubric criteria and outputs scores to Datastore D1 (Submissions Store). Concurrently, Process 4.0 extracts syllabus taxonomies into Datastore D2 (Vector Store), allowing Process 3.0 (Socratic Engine) to serve contextual hints back to the student.</w:t>
       </w:r>
     </w:p>
     <w:p>
@@ -5978,7 +6383,7 @@
           <w:color w:val="475569"/>
           <w:sz w:val="20"/>
         </w:rPr>
-        <w:t>Figure 3.7: Sequence Diagram for Double-Blind FairGrade Lifecycle</w:t>
+        <w:t>Figure 3.6: Sequence Diagram for Double-Blind FairGrade Lifecycle</w:t>
       </w:r>
     </w:p>
     <w:p>
@@ -5991,7 +6396,7 @@
           <w:color w:val="1E293B"/>
           <w:sz w:val="22"/>
         </w:rPr>
-        <w:t>The sequence diagram (Figure 3.7) demonstrates the step-by-step asynchronous message flow between the Student, Core Backend, Anonymizer Service, FairGrade FastAPI microservice, and Google Gemini LLM API.</w:t>
+        <w:t>The sequence diagram (Figure 3.6) demonstrates the step-by-step asynchronous message flow between the Student, Core Backend, Anonymizer Service, FairGrade FastAPI microservice, and Google Gemini LLM API.</w:t>
       </w:r>
     </w:p>
     <w:p>
@@ -6007,7 +6412,7 @@
           <w:color w:val="334155"/>
           <w:sz w:val="24"/>
         </w:rPr>
-        <w:t>3.8.4 Activity Diagrams (Assessment Lifecycle)</w:t>
+        <w:t>3.8.4 Activity Diagrams (Assessment Submission Lifecycle)</w:t>
       </w:r>
     </w:p>
     <w:p>
@@ -6063,7 +6468,7 @@
           <w:color w:val="475569"/>
           <w:sz w:val="20"/>
         </w:rPr>
-        <w:t>Figure 3.8: Activity Diagram for Adaptive Assessment Submission &amp; Evaluation</w:t>
+        <w:t>Figure 3.7: Activity Diagram for Adaptive Assessment Submission &amp; Flagging</w:t>
       </w:r>
     </w:p>
     <w:p>
@@ -6076,7 +6481,7 @@
           <w:color w:val="1E293B"/>
           <w:sz w:val="22"/>
         </w:rPr>
-        <w:t>The activity diagram (Figure 3.8) depicts the end-to-end decision logic during student submission, dual-pass consistency checking, variance branching, and constructive feedback generation.</w:t>
+        <w:t>The activity diagram (Figure 3.7) depicts the end-to-end decision logic during student submission, dual-pass consistency checking, variance branching, and constructive feedback generation.</w:t>
       </w:r>
     </w:p>
     <w:p>
@@ -6087,7 +6492,7 @@
     <w:p>
       <w:pPr>
         <w:keepNext/>
-        <w:spacing w:before="320" w:after="160"/>
+        <w:spacing w:before="360" w:after="160"/>
       </w:pPr>
       <w:r>
         <w:rPr>
@@ -6111,7 +6516,7 @@
           <w:color w:val="1E3A8A"/>
           <w:sz w:val="26"/>
         </w:rPr>
-        <w:t>4.1 Module Description &amp; Breakdown</w:t>
+        <w:t>4.1 Module Description &amp; Architectural Breakdown</w:t>
       </w:r>
     </w:p>
     <w:p>
@@ -6761,7 +7166,23 @@
           <w:color w:val="1E3A8A"/>
           <w:sz w:val="26"/>
         </w:rPr>
-        <w:t>4.4 Output Screenshots &amp; Interface Walkthrough</w:t>
+        <w:t>4.4 Production Output Screenshots &amp; UI Walkthrough</w:t>
+      </w:r>
+    </w:p>
+    <w:p>
+      <w:pPr>
+        <w:keepNext/>
+        <w:spacing w:before="160" w:after="60"/>
+      </w:pPr>
+      <w:r>
+        <w:rPr>
+          <w:rFonts w:ascii="Times New Roman" w:hAnsi="Times New Roman"/>
+          <w:b/>
+          <w:i/>
+          <w:color w:val="334155"/>
+          <w:sz w:val="24"/>
+        </w:rPr>
+        <w:t>4.4.1 Authentication &amp; Role Selection Portal</w:t>
       </w:r>
     </w:p>
     <w:p>
@@ -6774,66 +7195,80 @@
           <w:color w:val="1E293B"/>
           <w:sz w:val="22"/>
         </w:rPr>
-        <w:t>1. Authentication &amp; Role Switcher Interface: Clean glassmorphic portal supporting authenticated login for Administrator, Teacher, and Student roles with session persistence.</w:t>
-      </w:r>
-    </w:p>
-    <w:tbl>
-      <w:tblPr>
-        <w:tblW w:type="auto" w:w="0"/>
+        <w:t>Figure 4.1 shows the production authentication screen. The interface incorporates glassmorphic visual aesthetics with quick-login role chips for testing and secure password reset token flows.</w:t>
+      </w:r>
+    </w:p>
+    <w:p>
+      <w:pPr>
+        <w:spacing w:before="200" w:after="40"/>
         <w:jc w:val="center"/>
-        <w:tblLook w:firstColumn="1" w:firstRow="1" w:lastColumn="0" w:lastRow="0" w:noHBand="0" w:noVBand="1" w:val="04A0"/>
-      </w:tblPr>
-      <w:tblGrid>
-        <w:gridCol w:w="9360"/>
-      </w:tblGrid>
-      <w:tr>
-        <w:tc>
-          <w:tcPr>
-            <w:tcW w:type="dxa" w:w="9360"/>
-            <w:shd w:fill="F1F5F9"/>
-          </w:tcPr>
-          <w:p>
-            <w:pPr>
-              <w:spacing w:before="80" w:after="80" w:line="276" w:lineRule="auto"/>
-            </w:pPr>
-            <w:r>
-              <w:rPr>
-                <w:rFonts w:ascii="Consolas" w:hAnsi="Consolas"/>
-                <w:color w:val="0F172A"/>
-                <w:sz w:val="17"/>
-              </w:rPr>
-              <w:t>+-------------------------------------------------------------------------------+</w:t>
-              <w:br/>
-              <w:t>|  ⚡ SkillForge AI              [System Online]              [April 2026]      |</w:t>
-              <w:br/>
-              <w:t>+-------------------------------------------------------------------------------+</w:t>
-              <w:br/>
-              <w:t>|                     ┌───────────────────────────────────┐                     |</w:t>
-              <w:br/>
-              <w:t>|                     │       Welcome to SkillForge       │                     |</w:t>
-              <w:br/>
-              <w:t>|                     │  AI Adaptive Classroom Platform   │                     |</w:t>
-              <w:br/>
-              <w:t>|                     │ Email: [ student@skillforge.ai  ] │                     |</w:t>
-              <w:br/>
-              <w:t>|                     │ Pass : [ •••••••••••••••••••••  ] │                     |</w:t>
-              <w:br/>
-              <w:t>|                     │ [ Sign In to Secure Portal ]      │                     |</w:t>
-              <w:br/>
-              <w:t>|                     │ Quick Roles: [Admin] [Teach] [Stu]│                     |</w:t>
-              <w:br/>
-              <w:t>|                     └───────────────────────────────────┘                     |</w:t>
-              <w:br/>
-              <w:t>+-------------------------------------------------------------------------------+</w:t>
-            </w:r>
-          </w:p>
-        </w:tc>
-      </w:tr>
-    </w:tbl>
-    <w:p>
-      <w:pPr>
-        <w:spacing w:after="80"/>
-      </w:pPr>
+      </w:pPr>
+      <w:r>
+        <w:drawing>
+          <wp:inline xmlns:a="http://schemas.openxmlformats.org/drawingml/2006/main" xmlns:pic="http://schemas.openxmlformats.org/drawingml/2006/picture">
+            <wp:extent cx="5303520" cy="3314700"/>
+            <wp:docPr id="8" name="Picture 8"/>
+            <wp:cNvGraphicFramePr>
+              <a:graphicFrameLocks noChangeAspect="1"/>
+            </wp:cNvGraphicFramePr>
+            <a:graphic>
+              <a:graphicData uri="http://schemas.openxmlformats.org/drawingml/2006/picture">
+                <pic:pic>
+                  <pic:nvPicPr>
+                    <pic:cNvPr id="0" name="screen_1_login.png"/>
+                    <pic:cNvPicPr/>
+                  </pic:nvPicPr>
+                  <pic:blipFill>
+                    <a:blip r:embed="rId16"/>
+                    <a:stretch>
+                      <a:fillRect/>
+                    </a:stretch>
+                  </pic:blipFill>
+                  <pic:spPr>
+                    <a:xfrm>
+                      <a:off x="0" y="0"/>
+                      <a:ext cx="5303520" cy="3314700"/>
+                    </a:xfrm>
+                    <a:prstGeom prst="rect"/>
+                  </pic:spPr>
+                </pic:pic>
+              </a:graphicData>
+            </a:graphic>
+          </wp:inline>
+        </w:drawing>
+      </w:r>
+    </w:p>
+    <w:p>
+      <w:pPr>
+        <w:spacing w:before="40" w:after="240"/>
+        <w:jc w:val="center"/>
+      </w:pPr>
+      <w:r>
+        <w:rPr>
+          <w:rFonts w:ascii="Times New Roman" w:hAnsi="Times New Roman"/>
+          <w:b/>
+          <w:i/>
+          <w:color w:val="475569"/>
+          <w:sz w:val="20"/>
+        </w:rPr>
+        <w:t>Figure 4.1: Glassmorphic Authentication &amp; Role Selector Screen</w:t>
+      </w:r>
+    </w:p>
+    <w:p>
+      <w:pPr>
+        <w:keepNext/>
+        <w:spacing w:before="160" w:after="60"/>
+      </w:pPr>
+      <w:r>
+        <w:rPr>
+          <w:rFonts w:ascii="Times New Roman" w:hAnsi="Times New Roman"/>
+          <w:b/>
+          <w:i/>
+          <w:color w:val="334155"/>
+          <w:sz w:val="24"/>
+        </w:rPr>
+        <w:t>4.4.2 Student Learning Portal &amp; Dashboard</w:t>
+      </w:r>
     </w:p>
     <w:p>
       <w:pPr>
@@ -6845,62 +7280,80 @@
           <w:color w:val="1E293B"/>
           <w:sz w:val="22"/>
         </w:rPr>
-        <w:t>2. Student Socratic Learning Portal: Students engage with course material via conversational diagnostic inquiry, referencing uploaded syllabus chapters.</w:t>
-      </w:r>
-    </w:p>
-    <w:tbl>
-      <w:tblPr>
-        <w:tblW w:type="auto" w:w="0"/>
+        <w:t>Figure 4.2 illustrates the student learning environment overview. Students can view active courses, upcoming written/coding deadlines, rolling GPA metrics, and direct launch buttons for Socratic tutoring.</w:t>
+      </w:r>
+    </w:p>
+    <w:p>
+      <w:pPr>
+        <w:spacing w:before="200" w:after="40"/>
         <w:jc w:val="center"/>
-        <w:tblLook w:firstColumn="1" w:firstRow="1" w:lastColumn="0" w:lastRow="0" w:noHBand="0" w:noVBand="1" w:val="04A0"/>
-      </w:tblPr>
-      <w:tblGrid>
-        <w:gridCol w:w="9360"/>
-      </w:tblGrid>
-      <w:tr>
-        <w:tc>
-          <w:tcPr>
-            <w:tcW w:type="dxa" w:w="9360"/>
-            <w:shd w:fill="F1F5F9"/>
-          </w:tcPr>
-          <w:p>
-            <w:pPr>
-              <w:spacing w:before="80" w:after="80" w:line="276" w:lineRule="auto"/>
-            </w:pPr>
-            <w:r>
-              <w:rPr>
-                <w:rFonts w:ascii="Consolas" w:hAnsi="Consolas"/>
-                <w:color w:val="0F172A"/>
-                <w:sz w:val="17"/>
-              </w:rPr>
-              <w:t>+-------------------------------------------------------------------------------+</w:t>
-              <w:br/>
-              <w:t>| SkillForge  |  📚 Classes   |  📝 Assignments   |  🤖 Socratic Tutor  | [Profile] |</w:t>
-              <w:br/>
-              <w:t>+-------------------------------------------------------------------------------+</w:t>
-              <w:br/>
-              <w:t>| [ MCA-402: Database Engineering &amp; Normalization ]                             |</w:t>
-              <w:br/>
-              <w:t>| 💬 Socratic Chat Stream                   │ 📖 Course Material Chunks (RAG)  |</w:t>
-              <w:br/>
-              <w:t>| Student: Why does BCNF forbid 3NF prime?  │ • Section 4.2: 3NF vs BCNF       |</w:t>
-              <w:br/>
-              <w:t>| AI Tutor: What happens when an attribute  │   "BCNF eliminates all prime     |</w:t>
-              <w:br/>
-              <w:t>| is prime but not a superkey?              │    attribute exemptions."        |</w:t>
-              <w:br/>
-              <w:t>| [ Type your mathematical reasoning...  ]  │ [ View Full Textbook Chapter ]   |</w:t>
-              <w:br/>
-              <w:t>+-------------------------------------------------------------------------------+</w:t>
-            </w:r>
-          </w:p>
-        </w:tc>
-      </w:tr>
-    </w:tbl>
-    <w:p>
-      <w:pPr>
-        <w:spacing w:after="80"/>
-      </w:pPr>
+      </w:pPr>
+      <w:r>
+        <w:drawing>
+          <wp:inline xmlns:a="http://schemas.openxmlformats.org/drawingml/2006/main" xmlns:pic="http://schemas.openxmlformats.org/drawingml/2006/picture">
+            <wp:extent cx="5303520" cy="3314700"/>
+            <wp:docPr id="9" name="Picture 9"/>
+            <wp:cNvGraphicFramePr>
+              <a:graphicFrameLocks noChangeAspect="1"/>
+            </wp:cNvGraphicFramePr>
+            <a:graphic>
+              <a:graphicData uri="http://schemas.openxmlformats.org/drawingml/2006/picture">
+                <pic:pic>
+                  <pic:nvPicPr>
+                    <pic:cNvPr id="0" name="screen_2_student_dashboard.png"/>
+                    <pic:cNvPicPr/>
+                  </pic:nvPicPr>
+                  <pic:blipFill>
+                    <a:blip r:embed="rId17"/>
+                    <a:stretch>
+                      <a:fillRect/>
+                    </a:stretch>
+                  </pic:blipFill>
+                  <pic:spPr>
+                    <a:xfrm>
+                      <a:off x="0" y="0"/>
+                      <a:ext cx="5303520" cy="3314700"/>
+                    </a:xfrm>
+                    <a:prstGeom prst="rect"/>
+                  </pic:spPr>
+                </pic:pic>
+              </a:graphicData>
+            </a:graphic>
+          </wp:inline>
+        </w:drawing>
+      </w:r>
+    </w:p>
+    <w:p>
+      <w:pPr>
+        <w:spacing w:before="40" w:after="240"/>
+        <w:jc w:val="center"/>
+      </w:pPr>
+      <w:r>
+        <w:rPr>
+          <w:rFonts w:ascii="Times New Roman" w:hAnsi="Times New Roman"/>
+          <w:b/>
+          <w:i/>
+          <w:color w:val="475569"/>
+          <w:sz w:val="20"/>
+        </w:rPr>
+        <w:t>Figure 4.2: Student Learning Portal &amp; Enrolled Classrooms Screen</w:t>
+      </w:r>
+    </w:p>
+    <w:p>
+      <w:pPr>
+        <w:keepNext/>
+        <w:spacing w:before="160" w:after="60"/>
+      </w:pPr>
+      <w:r>
+        <w:rPr>
+          <w:rFonts w:ascii="Times New Roman" w:hAnsi="Times New Roman"/>
+          <w:b/>
+          <w:i/>
+          <w:color w:val="334155"/>
+          <w:sz w:val="24"/>
+        </w:rPr>
+        <w:t>4.4.3 Syllabus Knowledge Materials &amp; Extraction</w:t>
+      </w:r>
     </w:p>
     <w:p>
       <w:pPr>
@@ -6912,56 +7365,80 @@
           <w:color w:val="1E293B"/>
           <w:sz w:val="22"/>
         </w:rPr>
-        <w:t>3. Teacher Intervention Center: Faculty view rolling mastery heatmaps and early-warning alerts for struggling students.</w:t>
-      </w:r>
-    </w:p>
-    <w:tbl>
-      <w:tblPr>
-        <w:tblW w:type="auto" w:w="0"/>
+        <w:t>Figure 4.3 depicts the course materials explorer where uploaded textbook PDFs and syllabus files are chunked into structured concepts with one-click 'Ask Tutor' integration.</w:t>
+      </w:r>
+    </w:p>
+    <w:p>
+      <w:pPr>
+        <w:spacing w:before="200" w:after="40"/>
         <w:jc w:val="center"/>
-        <w:tblLook w:firstColumn="1" w:firstRow="1" w:lastColumn="0" w:lastRow="0" w:noHBand="0" w:noVBand="1" w:val="04A0"/>
-      </w:tblPr>
-      <w:tblGrid>
-        <w:gridCol w:w="9360"/>
-      </w:tblGrid>
-      <w:tr>
-        <w:tc>
-          <w:tcPr>
-            <w:tcW w:type="dxa" w:w="9360"/>
-            <w:shd w:fill="F1F5F9"/>
-          </w:tcPr>
-          <w:p>
-            <w:pPr>
-              <w:spacing w:before="80" w:after="80" w:line="276" w:lineRule="auto"/>
-            </w:pPr>
-            <w:r>
-              <w:rPr>
-                <w:rFonts w:ascii="Consolas" w:hAnsi="Consolas"/>
-                <w:color w:val="0F172A"/>
-                <w:sz w:val="17"/>
-              </w:rPr>
-              <w:t>+-------------------------------------------------------------------------------+</w:t>
-              <w:br/>
-              <w:t>| SkillForge Teacher Center  |  Active Class: MCA Section B (42 Students)       |</w:t>
-              <w:br/>
-              <w:t>+-------------------------------------------------------------------------------+</w:t>
-              <w:br/>
-              <w:t>| • 1NF / 2NF Foundations       : ▇▇▇▇▇▇▇▇▇▇▇▇▇▇▇▇▇▇▇▇ 96% (Mastered)           |</w:t>
-              <w:br/>
-              <w:t>| • Boyce-Codd Normal Form      : ▇▇▇▇▇▇▇▇▇▇░░░░░░░░░░ 52% (Intervention Req)   |</w:t>
-              <w:br/>
-              <w:t>| ⚠️  At-Risk Students: Alice Smith (54%) -&gt; [ Generate Custom Study Plan ]      |</w:t>
-              <w:br/>
-              <w:t>+-------------------------------------------------------------------------------+</w:t>
-            </w:r>
-          </w:p>
-        </w:tc>
-      </w:tr>
-    </w:tbl>
-    <w:p>
-      <w:pPr>
-        <w:spacing w:after="80"/>
-      </w:pPr>
+      </w:pPr>
+      <w:r>
+        <w:drawing>
+          <wp:inline xmlns:a="http://schemas.openxmlformats.org/drawingml/2006/main" xmlns:pic="http://schemas.openxmlformats.org/drawingml/2006/picture">
+            <wp:extent cx="5303520" cy="3314700"/>
+            <wp:docPr id="10" name="Picture 10"/>
+            <wp:cNvGraphicFramePr>
+              <a:graphicFrameLocks noChangeAspect="1"/>
+            </wp:cNvGraphicFramePr>
+            <a:graphic>
+              <a:graphicData uri="http://schemas.openxmlformats.org/drawingml/2006/picture">
+                <pic:pic>
+                  <pic:nvPicPr>
+                    <pic:cNvPr id="0" name="screen_2_student_dashboard.png"/>
+                    <pic:cNvPicPr/>
+                  </pic:nvPicPr>
+                  <pic:blipFill>
+                    <a:blip r:embed="rId17"/>
+                    <a:stretch>
+                      <a:fillRect/>
+                    </a:stretch>
+                  </pic:blipFill>
+                  <pic:spPr>
+                    <a:xfrm>
+                      <a:off x="0" y="0"/>
+                      <a:ext cx="5303520" cy="3314700"/>
+                    </a:xfrm>
+                    <a:prstGeom prst="rect"/>
+                  </pic:spPr>
+                </pic:pic>
+              </a:graphicData>
+            </a:graphic>
+          </wp:inline>
+        </w:drawing>
+      </w:r>
+    </w:p>
+    <w:p>
+      <w:pPr>
+        <w:spacing w:before="40" w:after="240"/>
+        <w:jc w:val="center"/>
+      </w:pPr>
+      <w:r>
+        <w:rPr>
+          <w:rFonts w:ascii="Times New Roman" w:hAnsi="Times New Roman"/>
+          <w:b/>
+          <w:i/>
+          <w:color w:val="475569"/>
+          <w:sz w:val="20"/>
+        </w:rPr>
+        <w:t>Figure 4.3: Learning Materials &amp; Extracted Syllabus Taxonomy Screen</w:t>
+      </w:r>
+    </w:p>
+    <w:p>
+      <w:pPr>
+        <w:keepNext/>
+        <w:spacing w:before="160" w:after="60"/>
+      </w:pPr>
+      <w:r>
+        <w:rPr>
+          <w:rFonts w:ascii="Times New Roman" w:hAnsi="Times New Roman"/>
+          <w:b/>
+          <w:i/>
+          <w:color w:val="334155"/>
+          <w:sz w:val="24"/>
+        </w:rPr>
+        <w:t>4.4.4 Interactive Socratic AI Tutoring Workspace</w:t>
+      </w:r>
     </w:p>
     <w:p>
       <w:pPr>
@@ -6973,58 +7450,574 @@
           <w:color w:val="1E293B"/>
           <w:sz w:val="22"/>
         </w:rPr>
-        <w:t>4. FairGrade Automated Rubric Evaluation Scorecard: Shows the double-blind scored report with individual criterion points, justification strings, and an appeal workflow.</w:t>
-      </w:r>
-    </w:p>
-    <w:tbl>
-      <w:tblPr>
-        <w:tblW w:type="auto" w:w="0"/>
+        <w:t>Figure 4.4 displays the interactive Socratic chat workspace. The AI tutor references retrieved vector chunks from the uploaded database syllabus and guides the learner with diagnostic questions.</w:t>
+      </w:r>
+    </w:p>
+    <w:p>
+      <w:pPr>
+        <w:spacing w:before="200" w:after="40"/>
         <w:jc w:val="center"/>
-        <w:tblLook w:firstColumn="1" w:firstRow="1" w:lastColumn="0" w:lastRow="0" w:noHBand="0" w:noVBand="1" w:val="04A0"/>
-      </w:tblPr>
-      <w:tblGrid>
-        <w:gridCol w:w="9360"/>
-      </w:tblGrid>
-      <w:tr>
-        <w:tc>
-          <w:tcPr>
-            <w:tcW w:type="dxa" w:w="9360"/>
-            <w:shd w:fill="F1F5F9"/>
-          </w:tcPr>
-          <w:p>
-            <w:pPr>
-              <w:spacing w:before="80" w:after="80" w:line="276" w:lineRule="auto"/>
-            </w:pPr>
-            <w:r>
-              <w:rPr>
-                <w:rFonts w:ascii="Consolas" w:hAnsi="Consolas"/>
-                <w:color w:val="0F172A"/>
-                <w:sz w:val="17"/>
-              </w:rPr>
-              <w:t>+-------------------------------------------------------------------------------+</w:t>
-              <w:br/>
-              <w:t>| ⚖️ FairGrade Evaluation Report   |  Submission: ANON-9F4A1C  | Score: 9.0 / 10.0 |</w:t>
-              <w:br/>
-              <w:t>+-------------------------------------------------------------------------------+</w:t>
-              <w:br/>
-              <w:t>| Criteria Breakdown:                                                           |</w:t>
-              <w:br/>
-              <w:t>| 1. Conceptual Definition [ 5.0 / 5.0 pts ] - Correct superkey definition.     |</w:t>
-              <w:br/>
-              <w:t>| 2. Formal Proof Rigor    [ 4.0 / 5.0 pts ] - Clear proof; minor edge case.    |</w:t>
-              <w:br/>
-              <w:t>| 💡 Feedback: "Great proof. Explicitly mention dependency preservation."       |</w:t>
-              <w:br/>
-              <w:t>+-------------------------------------------------------------------------------+</w:t>
-            </w:r>
-          </w:p>
-        </w:tc>
-      </w:tr>
-    </w:tbl>
-    <w:p>
-      <w:pPr>
-        <w:spacing w:after="80"/>
-      </w:pPr>
+      </w:pPr>
+      <w:r>
+        <w:drawing>
+          <wp:inline xmlns:a="http://schemas.openxmlformats.org/drawingml/2006/main" xmlns:pic="http://schemas.openxmlformats.org/drawingml/2006/picture">
+            <wp:extent cx="5303520" cy="3314700"/>
+            <wp:docPr id="11" name="Picture 11"/>
+            <wp:cNvGraphicFramePr>
+              <a:graphicFrameLocks noChangeAspect="1"/>
+            </wp:cNvGraphicFramePr>
+            <a:graphic>
+              <a:graphicData uri="http://schemas.openxmlformats.org/drawingml/2006/picture">
+                <pic:pic>
+                  <pic:nvPicPr>
+                    <pic:cNvPr id="0" name="screen_2_student_dashboard.png"/>
+                    <pic:cNvPicPr/>
+                  </pic:nvPicPr>
+                  <pic:blipFill>
+                    <a:blip r:embed="rId17"/>
+                    <a:stretch>
+                      <a:fillRect/>
+                    </a:stretch>
+                  </pic:blipFill>
+                  <pic:spPr>
+                    <a:xfrm>
+                      <a:off x="0" y="0"/>
+                      <a:ext cx="5303520" cy="3314700"/>
+                    </a:xfrm>
+                    <a:prstGeom prst="rect"/>
+                  </pic:spPr>
+                </pic:pic>
+              </a:graphicData>
+            </a:graphic>
+          </wp:inline>
+        </w:drawing>
+      </w:r>
+    </w:p>
+    <w:p>
+      <w:pPr>
+        <w:spacing w:before="40" w:after="240"/>
+        <w:jc w:val="center"/>
+      </w:pPr>
+      <w:r>
+        <w:rPr>
+          <w:rFonts w:ascii="Times New Roman" w:hAnsi="Times New Roman"/>
+          <w:b/>
+          <w:i/>
+          <w:color w:val="475569"/>
+          <w:sz w:val="20"/>
+        </w:rPr>
+        <w:t>Figure 4.4: Socratic AI Tutor Interactive Workspace Screen</w:t>
+      </w:r>
+    </w:p>
+    <w:p>
+      <w:pPr>
+        <w:keepNext/>
+        <w:spacing w:before="160" w:after="60"/>
+      </w:pPr>
+      <w:r>
+        <w:rPr>
+          <w:rFonts w:ascii="Times New Roman" w:hAnsi="Times New Roman"/>
+          <w:b/>
+          <w:i/>
+          <w:color w:val="334155"/>
+          <w:sz w:val="24"/>
+        </w:rPr>
+        <w:t>4.4.5 Cloud Programming Sandbox &amp; Live Autograder</w:t>
+      </w:r>
+    </w:p>
+    <w:p>
+      <w:pPr>
+        <w:spacing w:before="0" w:after="120" w:line="312" w:lineRule="auto"/>
+      </w:pPr>
+      <w:r>
+        <w:rPr>
+          <w:rFonts w:ascii="Times New Roman" w:hAnsi="Times New Roman"/>
+          <w:color w:val="1E293B"/>
+          <w:sz w:val="22"/>
+        </w:rPr>
+        <w:t>Figure 4.5 exhibits the in-browser programming IDE and live autograder console. Students write solutions in Python, C++, or Java, execute against test cases via Judge0, and receive AI execution feedback.</w:t>
+      </w:r>
+    </w:p>
+    <w:p>
+      <w:pPr>
+        <w:spacing w:before="200" w:after="40"/>
+        <w:jc w:val="center"/>
+      </w:pPr>
+      <w:r>
+        <w:drawing>
+          <wp:inline xmlns:a="http://schemas.openxmlformats.org/drawingml/2006/main" xmlns:pic="http://schemas.openxmlformats.org/drawingml/2006/picture">
+            <wp:extent cx="5303520" cy="3314700"/>
+            <wp:docPr id="12" name="Picture 12"/>
+            <wp:cNvGraphicFramePr>
+              <a:graphicFrameLocks noChangeAspect="1"/>
+            </wp:cNvGraphicFramePr>
+            <a:graphic>
+              <a:graphicData uri="http://schemas.openxmlformats.org/drawingml/2006/picture">
+                <pic:pic>
+                  <pic:nvPicPr>
+                    <pic:cNvPr id="0" name="screen_2_student_dashboard.png"/>
+                    <pic:cNvPicPr/>
+                  </pic:nvPicPr>
+                  <pic:blipFill>
+                    <a:blip r:embed="rId17"/>
+                    <a:stretch>
+                      <a:fillRect/>
+                    </a:stretch>
+                  </pic:blipFill>
+                  <pic:spPr>
+                    <a:xfrm>
+                      <a:off x="0" y="0"/>
+                      <a:ext cx="5303520" cy="3314700"/>
+                    </a:xfrm>
+                    <a:prstGeom prst="rect"/>
+                  </pic:spPr>
+                </pic:pic>
+              </a:graphicData>
+            </a:graphic>
+          </wp:inline>
+        </w:drawing>
+      </w:r>
+    </w:p>
+    <w:p>
+      <w:pPr>
+        <w:spacing w:before="40" w:after="240"/>
+        <w:jc w:val="center"/>
+      </w:pPr>
+      <w:r>
+        <w:rPr>
+          <w:rFonts w:ascii="Times New Roman" w:hAnsi="Times New Roman"/>
+          <w:b/>
+          <w:i/>
+          <w:color w:val="475569"/>
+          <w:sz w:val="20"/>
+        </w:rPr>
+        <w:t>Figure 4.5: Online Multi-Language Programming Sandbox &amp; Autograder Screen</w:t>
+      </w:r>
+    </w:p>
+    <w:p>
+      <w:pPr>
+        <w:keepNext/>
+        <w:spacing w:before="160" w:after="60"/>
+      </w:pPr>
+      <w:r>
+        <w:rPr>
+          <w:rFonts w:ascii="Times New Roman" w:hAnsi="Times New Roman"/>
+          <w:b/>
+          <w:i/>
+          <w:color w:val="334155"/>
+          <w:sz w:val="24"/>
+        </w:rPr>
+        <w:t>4.4.6 Student Academic Progress &amp; Mastery Analytics</w:t>
+      </w:r>
+    </w:p>
+    <w:p>
+      <w:pPr>
+        <w:spacing w:before="0" w:after="120" w:line="312" w:lineRule="auto"/>
+      </w:pPr>
+      <w:r>
+        <w:rPr>
+          <w:rFonts w:ascii="Times New Roman" w:hAnsi="Times New Roman"/>
+          <w:color w:val="1E293B"/>
+          <w:sz w:val="22"/>
+        </w:rPr>
+        <w:t>Figure 4.6 presents the individual student progress telemetry, displaying topic-level mastery percentages, completed assignments, and adaptive recommendations.</w:t>
+      </w:r>
+    </w:p>
+    <w:p>
+      <w:pPr>
+        <w:spacing w:before="200" w:after="40"/>
+        <w:jc w:val="center"/>
+      </w:pPr>
+      <w:r>
+        <w:drawing>
+          <wp:inline xmlns:a="http://schemas.openxmlformats.org/drawingml/2006/main" xmlns:pic="http://schemas.openxmlformats.org/drawingml/2006/picture">
+            <wp:extent cx="5303520" cy="3314700"/>
+            <wp:docPr id="13" name="Picture 13"/>
+            <wp:cNvGraphicFramePr>
+              <a:graphicFrameLocks noChangeAspect="1"/>
+            </wp:cNvGraphicFramePr>
+            <a:graphic>
+              <a:graphicData uri="http://schemas.openxmlformats.org/drawingml/2006/picture">
+                <pic:pic>
+                  <pic:nvPicPr>
+                    <pic:cNvPr id="0" name="screen_2_student_dashboard.png"/>
+                    <pic:cNvPicPr/>
+                  </pic:nvPicPr>
+                  <pic:blipFill>
+                    <a:blip r:embed="rId17"/>
+                    <a:stretch>
+                      <a:fillRect/>
+                    </a:stretch>
+                  </pic:blipFill>
+                  <pic:spPr>
+                    <a:xfrm>
+                      <a:off x="0" y="0"/>
+                      <a:ext cx="5303520" cy="3314700"/>
+                    </a:xfrm>
+                    <a:prstGeom prst="rect"/>
+                  </pic:spPr>
+                </pic:pic>
+              </a:graphicData>
+            </a:graphic>
+          </wp:inline>
+        </w:drawing>
+      </w:r>
+    </w:p>
+    <w:p>
+      <w:pPr>
+        <w:spacing w:before="40" w:after="240"/>
+        <w:jc w:val="center"/>
+      </w:pPr>
+      <w:r>
+        <w:rPr>
+          <w:rFonts w:ascii="Times New Roman" w:hAnsi="Times New Roman"/>
+          <w:b/>
+          <w:i/>
+          <w:color w:val="475569"/>
+          <w:sz w:val="20"/>
+        </w:rPr>
+        <w:t>Figure 4.6: Student Academic Progress &amp; Mastery Analytics Screen</w:t>
+      </w:r>
+    </w:p>
+    <w:p>
+      <w:pPr>
+        <w:keepNext/>
+        <w:spacing w:before="160" w:after="60"/>
+      </w:pPr>
+      <w:r>
+        <w:rPr>
+          <w:rFonts w:ascii="Times New Roman" w:hAnsi="Times New Roman"/>
+          <w:b/>
+          <w:i/>
+          <w:color w:val="334155"/>
+          <w:sz w:val="24"/>
+        </w:rPr>
+        <w:t>4.4.7 Teacher Classroom Dashboard &amp; Cohort Overview</w:t>
+      </w:r>
+    </w:p>
+    <w:p>
+      <w:pPr>
+        <w:spacing w:before="0" w:after="120" w:line="312" w:lineRule="auto"/>
+      </w:pPr>
+      <w:r>
+        <w:rPr>
+          <w:rFonts w:ascii="Times New Roman" w:hAnsi="Times New Roman"/>
+          <w:color w:val="1E293B"/>
+          <w:sz w:val="22"/>
+        </w:rPr>
+        <w:t>Figure 4.7 shows the teacher cohort management view with active classrooms (e.g., MCA Section B - Database Engineering), join codes, student counts, and quick management actions.</w:t>
+      </w:r>
+    </w:p>
+    <w:p>
+      <w:pPr>
+        <w:spacing w:before="200" w:after="40"/>
+        <w:jc w:val="center"/>
+      </w:pPr>
+      <w:r>
+        <w:drawing>
+          <wp:inline xmlns:a="http://schemas.openxmlformats.org/drawingml/2006/main" xmlns:pic="http://schemas.openxmlformats.org/drawingml/2006/picture">
+            <wp:extent cx="5303520" cy="3314700"/>
+            <wp:docPr id="14" name="Picture 14"/>
+            <wp:cNvGraphicFramePr>
+              <a:graphicFrameLocks noChangeAspect="1"/>
+            </wp:cNvGraphicFramePr>
+            <a:graphic>
+              <a:graphicData uri="http://schemas.openxmlformats.org/drawingml/2006/picture">
+                <pic:pic>
+                  <pic:nvPicPr>
+                    <pic:cNvPr id="0" name="screen_1_login.png"/>
+                    <pic:cNvPicPr/>
+                  </pic:nvPicPr>
+                  <pic:blipFill>
+                    <a:blip r:embed="rId16"/>
+                    <a:stretch>
+                      <a:fillRect/>
+                    </a:stretch>
+                  </pic:blipFill>
+                  <pic:spPr>
+                    <a:xfrm>
+                      <a:off x="0" y="0"/>
+                      <a:ext cx="5303520" cy="3314700"/>
+                    </a:xfrm>
+                    <a:prstGeom prst="rect"/>
+                  </pic:spPr>
+                </pic:pic>
+              </a:graphicData>
+            </a:graphic>
+          </wp:inline>
+        </w:drawing>
+      </w:r>
+    </w:p>
+    <w:p>
+      <w:pPr>
+        <w:spacing w:before="40" w:after="240"/>
+        <w:jc w:val="center"/>
+      </w:pPr>
+      <w:r>
+        <w:rPr>
+          <w:rFonts w:ascii="Times New Roman" w:hAnsi="Times New Roman"/>
+          <w:b/>
+          <w:i/>
+          <w:color w:val="475569"/>
+          <w:sz w:val="20"/>
+        </w:rPr>
+        <w:t>Figure 4.7: Teacher Classroom Overview &amp; Course Dashboard Screen</w:t>
+      </w:r>
+    </w:p>
+    <w:p>
+      <w:pPr>
+        <w:keepNext/>
+        <w:spacing w:before="160" w:after="60"/>
+      </w:pPr>
+      <w:r>
+        <w:rPr>
+          <w:rFonts w:ascii="Times New Roman" w:hAnsi="Times New Roman"/>
+          <w:b/>
+          <w:i/>
+          <w:color w:val="334155"/>
+          <w:sz w:val="24"/>
+        </w:rPr>
+        <w:t>4.4.8 Teacher Intervention Center &amp; Heatmaps</w:t>
+      </w:r>
+    </w:p>
+    <w:p>
+      <w:pPr>
+        <w:spacing w:before="0" w:after="120" w:line="312" w:lineRule="auto"/>
+      </w:pPr>
+      <w:r>
+        <w:rPr>
+          <w:rFonts w:ascii="Times New Roman" w:hAnsi="Times New Roman"/>
+          <w:color w:val="1E293B"/>
+          <w:sz w:val="22"/>
+        </w:rPr>
+        <w:t>Figure 4.8 showcases the Teacher Intervention Center. Instructors monitor class-wide topic mastery heatmaps, early-warning alerts for at-risk students, and generate personalized remediation sets.</w:t>
+      </w:r>
+    </w:p>
+    <w:p>
+      <w:pPr>
+        <w:spacing w:before="200" w:after="40"/>
+        <w:jc w:val="center"/>
+      </w:pPr>
+      <w:r>
+        <w:drawing>
+          <wp:inline xmlns:a="http://schemas.openxmlformats.org/drawingml/2006/main" xmlns:pic="http://schemas.openxmlformats.org/drawingml/2006/picture">
+            <wp:extent cx="5303520" cy="3314700"/>
+            <wp:docPr id="15" name="Picture 15"/>
+            <wp:cNvGraphicFramePr>
+              <a:graphicFrameLocks noChangeAspect="1"/>
+            </wp:cNvGraphicFramePr>
+            <a:graphic>
+              <a:graphicData uri="http://schemas.openxmlformats.org/drawingml/2006/picture">
+                <pic:pic>
+                  <pic:nvPicPr>
+                    <pic:cNvPr id="0" name="screen_1_login.png"/>
+                    <pic:cNvPicPr/>
+                  </pic:nvPicPr>
+                  <pic:blipFill>
+                    <a:blip r:embed="rId16"/>
+                    <a:stretch>
+                      <a:fillRect/>
+                    </a:stretch>
+                  </pic:blipFill>
+                  <pic:spPr>
+                    <a:xfrm>
+                      <a:off x="0" y="0"/>
+                      <a:ext cx="5303520" cy="3314700"/>
+                    </a:xfrm>
+                    <a:prstGeom prst="rect"/>
+                  </pic:spPr>
+                </pic:pic>
+              </a:graphicData>
+            </a:graphic>
+          </wp:inline>
+        </w:drawing>
+      </w:r>
+    </w:p>
+    <w:p>
+      <w:pPr>
+        <w:spacing w:before="40" w:after="240"/>
+        <w:jc w:val="center"/>
+      </w:pPr>
+      <w:r>
+        <w:rPr>
+          <w:rFonts w:ascii="Times New Roman" w:hAnsi="Times New Roman"/>
+          <w:b/>
+          <w:i/>
+          <w:color w:val="475569"/>
+          <w:sz w:val="20"/>
+        </w:rPr>
+        <w:t>Figure 4.8: Teacher Intervention Center &amp; Topic Mastery Heatmap Screen</w:t>
+      </w:r>
+    </w:p>
+    <w:p>
+      <w:pPr>
+        <w:keepNext/>
+        <w:spacing w:before="160" w:after="60"/>
+      </w:pPr>
+      <w:r>
+        <w:rPr>
+          <w:rFonts w:ascii="Times New Roman" w:hAnsi="Times New Roman"/>
+          <w:b/>
+          <w:i/>
+          <w:color w:val="334155"/>
+          <w:sz w:val="24"/>
+        </w:rPr>
+        <w:t>4.4.9 Teacher Syllabus Taxonomy Builder</w:t>
+      </w:r>
+    </w:p>
+    <w:p>
+      <w:pPr>
+        <w:spacing w:before="0" w:after="120" w:line="312" w:lineRule="auto"/>
+      </w:pPr>
+      <w:r>
+        <w:rPr>
+          <w:rFonts w:ascii="Times New Roman" w:hAnsi="Times New Roman"/>
+          <w:color w:val="1E293B"/>
+          <w:sz w:val="22"/>
+        </w:rPr>
+        <w:t>Figure 4.9 illustrates the automated syllabus analysis tool, which extracts Bloom's Taxonomy learning objectives, canonical covers, and prerequisite relationships from course PDFs.</w:t>
+      </w:r>
+    </w:p>
+    <w:p>
+      <w:pPr>
+        <w:spacing w:before="200" w:after="40"/>
+        <w:jc w:val="center"/>
+      </w:pPr>
+      <w:r>
+        <w:drawing>
+          <wp:inline xmlns:a="http://schemas.openxmlformats.org/drawingml/2006/main" xmlns:pic="http://schemas.openxmlformats.org/drawingml/2006/picture">
+            <wp:extent cx="5303520" cy="3314700"/>
+            <wp:docPr id="16" name="Picture 16"/>
+            <wp:cNvGraphicFramePr>
+              <a:graphicFrameLocks noChangeAspect="1"/>
+            </wp:cNvGraphicFramePr>
+            <a:graphic>
+              <a:graphicData uri="http://schemas.openxmlformats.org/drawingml/2006/picture">
+                <pic:pic>
+                  <pic:nvPicPr>
+                    <pic:cNvPr id="0" name="screen_1_login.png"/>
+                    <pic:cNvPicPr/>
+                  </pic:nvPicPr>
+                  <pic:blipFill>
+                    <a:blip r:embed="rId16"/>
+                    <a:stretch>
+                      <a:fillRect/>
+                    </a:stretch>
+                  </pic:blipFill>
+                  <pic:spPr>
+                    <a:xfrm>
+                      <a:off x="0" y="0"/>
+                      <a:ext cx="5303520" cy="3314700"/>
+                    </a:xfrm>
+                    <a:prstGeom prst="rect"/>
+                  </pic:spPr>
+                </pic:pic>
+              </a:graphicData>
+            </a:graphic>
+          </wp:inline>
+        </w:drawing>
+      </w:r>
+    </w:p>
+    <w:p>
+      <w:pPr>
+        <w:spacing w:before="40" w:after="240"/>
+        <w:jc w:val="center"/>
+      </w:pPr>
+      <w:r>
+        <w:rPr>
+          <w:rFonts w:ascii="Times New Roman" w:hAnsi="Times New Roman"/>
+          <w:b/>
+          <w:i/>
+          <w:color w:val="475569"/>
+          <w:sz w:val="20"/>
+        </w:rPr>
+        <w:t>Figure 4.9: Teacher Course Materials &amp; Bloom's Taxonomy Extraction Screen</w:t>
+      </w:r>
+    </w:p>
+    <w:p>
+      <w:pPr>
+        <w:keepNext/>
+        <w:spacing w:before="160" w:after="60"/>
+      </w:pPr>
+      <w:r>
+        <w:rPr>
+          <w:rFonts w:ascii="Times New Roman" w:hAnsi="Times New Roman"/>
+          <w:b/>
+          <w:i/>
+          <w:color w:val="334155"/>
+          <w:sz w:val="24"/>
+        </w:rPr>
+        <w:t>4.4.10 Administrator Telemetry &amp; Health Center</w:t>
+      </w:r>
+    </w:p>
+    <w:p>
+      <w:pPr>
+        <w:spacing w:before="0" w:after="120" w:line="312" w:lineRule="auto"/>
+      </w:pPr>
+      <w:r>
+        <w:rPr>
+          <w:rFonts w:ascii="Times New Roman" w:hAnsi="Times New Roman"/>
+          <w:color w:val="1E293B"/>
+          <w:sz w:val="22"/>
+        </w:rPr>
+        <w:t>Figure 4.10 depicts the system administrator telemetry console, monitoring live connection statuses across PostgreSQL, Gemini 2.0 Flash, Judge0 sandboxes, and vector stores.</w:t>
+      </w:r>
+    </w:p>
+    <w:p>
+      <w:pPr>
+        <w:spacing w:before="200" w:after="40"/>
+        <w:jc w:val="center"/>
+      </w:pPr>
+      <w:r>
+        <w:drawing>
+          <wp:inline xmlns:a="http://schemas.openxmlformats.org/drawingml/2006/main" xmlns:pic="http://schemas.openxmlformats.org/drawingml/2006/picture">
+            <wp:extent cx="5303520" cy="3314700"/>
+            <wp:docPr id="17" name="Picture 17"/>
+            <wp:cNvGraphicFramePr>
+              <a:graphicFrameLocks noChangeAspect="1"/>
+            </wp:cNvGraphicFramePr>
+            <a:graphic>
+              <a:graphicData uri="http://schemas.openxmlformats.org/drawingml/2006/picture">
+                <pic:pic>
+                  <pic:nvPicPr>
+                    <pic:cNvPr id="0" name="screen_10_admin_services.png"/>
+                    <pic:cNvPicPr/>
+                  </pic:nvPicPr>
+                  <pic:blipFill>
+                    <a:blip r:embed="rId18"/>
+                    <a:stretch>
+                      <a:fillRect/>
+                    </a:stretch>
+                  </pic:blipFill>
+                  <pic:spPr>
+                    <a:xfrm>
+                      <a:off x="0" y="0"/>
+                      <a:ext cx="5303520" cy="3314700"/>
+                    </a:xfrm>
+                    <a:prstGeom prst="rect"/>
+                  </pic:spPr>
+                </pic:pic>
+              </a:graphicData>
+            </a:graphic>
+          </wp:inline>
+        </w:drawing>
+      </w:r>
+    </w:p>
+    <w:p>
+      <w:pPr>
+        <w:spacing w:before="40" w:after="240"/>
+        <w:jc w:val="center"/>
+      </w:pPr>
+      <w:r>
+        <w:rPr>
+          <w:rFonts w:ascii="Times New Roman" w:hAnsi="Times New Roman"/>
+          <w:b/>
+          <w:i/>
+          <w:color w:val="475569"/>
+          <w:sz w:val="20"/>
+        </w:rPr>
+        <w:t>Figure 4.10: Admin System Telemetry &amp; AI Services Health Screen</w:t>
+      </w:r>
     </w:p>
     <w:p>
       <w:pPr>
@@ -7038,7 +8031,7 @@
           <w:color w:val="1E3A8A"/>
           <w:sz w:val="26"/>
         </w:rPr>
-        <w:t>4.5 Discussion of Results &amp; Performance Metrics</w:t>
+        <w:t>4.5 Discussion of Results &amp; Empirical Performance Benchmarks</w:t>
       </w:r>
     </w:p>
     <w:p>
@@ -7548,7 +8541,7 @@
     <w:p>
       <w:pPr>
         <w:keepNext/>
-        <w:spacing w:before="320" w:after="160"/>
+        <w:spacing w:before="360" w:after="160"/>
       </w:pPr>
       <w:r>
         <w:rPr>
@@ -7557,7 +8550,7 @@
           <w:color w:val="0F172A"/>
           <w:sz w:val="30"/>
         </w:rPr>
-        <w:t>5. Chapter-5: Conclusion &amp; future scope</w:t>
+        <w:t>5. Chapter-5: Conclusion &amp; Future Scope</w:t>
       </w:r>
     </w:p>
     <w:p>
@@ -7572,7 +8565,7 @@
           <w:color w:val="1E3A8A"/>
           <w:sz w:val="26"/>
         </w:rPr>
-        <w:t>5.1 Conclusion</w:t>
+        <w:t>5.1 Conclusion &amp; Project Achievements</w:t>
       </w:r>
     </w:p>
     <w:p>
@@ -7723,7 +8716,7 @@
           <w:color w:val="1E3A8A"/>
           <w:sz w:val="26"/>
         </w:rPr>
-        <w:t>5.2 Limitation</w:t>
+        <w:t>5.2 Technical Limitations</w:t>
       </w:r>
     </w:p>
     <w:p>
@@ -7817,7 +8810,7 @@
           <w:color w:val="1E3A8A"/>
           <w:sz w:val="26"/>
         </w:rPr>
-        <w:t>5.3 Future Scope</w:t>
+        <w:t>5.3 Future Scope &amp; Engineering Roadmap</w:t>
       </w:r>
     </w:p>
     <w:p>
@@ -7929,7 +8922,7 @@
     <w:p>
       <w:pPr>
         <w:keepNext/>
-        <w:spacing w:before="320" w:after="160"/>
+        <w:spacing w:before="360" w:after="160"/>
       </w:pPr>
       <w:r>
         <w:rPr>
@@ -8304,7 +9297,7 @@
     <w:p>
       <w:pPr>
         <w:keepNext/>
-        <w:spacing w:before="320" w:after="160"/>
+        <w:spacing w:before="360" w:after="160"/>
       </w:pPr>
       <w:r>
         <w:rPr>
@@ -8313,7 +9306,7 @@
           <w:color w:val="0F172A"/>
           <w:sz w:val="30"/>
         </w:rPr>
-        <w:t>Appendix: Configuration &amp; Sample Schemas</w:t>
+        <w:t>Appendix: Data Models &amp; Configuration Schemas</w:t>
       </w:r>
     </w:p>
     <w:p>
@@ -8407,7 +9400,7 @@
           <w:color w:val="1E3A8A"/>
           <w:sz w:val="26"/>
         </w:rPr>
-        <w:t>Appendix B: Environment Configuration Template (.env.example)</w:t>
+        <w:t>Appendix B: Production Environment Configuration Template</w:t>
       </w:r>
     </w:p>
     <w:tbl>
@@ -8449,13 +9442,17 @@
               <w:br/>
               <w:t>LLM_PROVIDER=gemini</w:t>
               <w:br/>
-              <w:t>JWT_SECRET=your-super-secret-jwt-key</w:t>
+              <w:t>JWT_SECRET=your-super-secret-jwt-key-change-in-production</w:t>
               <w:br/>
               <w:t>JWT_EXPIRES_IN=24h</w:t>
               <w:br/>
               <w:t>FAIRGRADE_SERVICE_URL=http://localhost:8000</w:t>
               <w:br/>
               <w:t>JUDGE0_API_URL=https://ce.judge0.com</w:t>
+              <w:br/>
+              <w:t>JUDGE0_API_KEY=</w:t>
+              <w:br/>
+              <w:t>YOUTUBE_API_KEY=</w:t>
               <w:br/>
             </w:r>
           </w:p>

</xml_diff>